<commit_message>
Add platform compliance section to SM Spec, bump to v1.3
Co-Authored-By: Claude Opus 4.6 (1M context) <noreply@anthropic.com>
</commit_message>
<xml_diff>
--- a/StaxAI-SM-Spec-v1_2.docx
+++ b/StaxAI-SM-Spec-v1_2.docx
@@ -1017,7 +1017,1622 @@
           <w:sz w:val="32"/>
           <w:szCs w:val="32"/>
         </w:rPr>
-        <w:t xml:space="preserve">2. Terminology</w:t>
+        <w:t xml:space="preserve">2. Platform Compliance — MANDATORY</w:t>
+      </w:r>
+    </w:p>
+    <w:p>
+      <w:pPr>
+        <w:spacing w:after="120"/>
+      </w:pPr>
+      <w:r>
+        <w:rPr>
+          <w:rFonts w:ascii="Arial" w:cs="Arial" w:eastAsia="Arial" w:hAnsi="Arial"/>
+          <w:b/>
+          <w:bCs/>
+          <w:sz w:val="22"/>
+          <w:szCs w:val="22"/>
+        </w:rPr>
+        <w:t xml:space="preserve">WARNING: This section is non-negotiable. Code must read and follow these requirements before writing any code. Violations will require rebuild.</w:t>
+      </w:r>
+    </w:p>
+    <w:p>
+      <w:pPr>
+        <w:pStyle w:val="Heading2"/>
+        <w:spacing w:after="160" w:before="300"/>
+      </w:pPr>
+      <w:r>
+        <w:rPr>
+          <w:rFonts w:ascii="Arial" w:cs="Arial" w:eastAsia="Arial" w:hAnsi="Arial"/>
+          <w:b/>
+          <w:bCs/>
+          <w:sz w:val="26"/>
+          <w:szCs w:val="26"/>
+        </w:rPr>
+        <w:t xml:space="preserve">Files to Read First</w:t>
+      </w:r>
+    </w:p>
+    <w:p>
+      <w:pPr>
+        <w:spacing w:after="120"/>
+      </w:pPr>
+      <w:r>
+        <w:rPr>
+          <w:rFonts w:ascii="Arial" w:cs="Arial" w:eastAsia="Arial" w:hAnsi="Arial"/>
+          <w:sz w:val="22"/>
+          <w:szCs w:val="22"/>
+        </w:rPr>
+        <w:t xml:space="preserve">Before starting any build work, Code must read these files in full:</w:t>
+      </w:r>
+    </w:p>
+    <w:p>
+      <w:pPr>
+        <w:pStyle w:val="ListParagraph"/>
+        <w:numPr>
+          <w:ilvl w:val="0"/>
+          <w:numId w:val="1"/>
+        </w:numPr>
+        <w:spacing w:after="80"/>
+      </w:pPr>
+      <w:r>
+        <w:rPr>
+          <w:rFonts w:ascii="Arial" w:cs="Arial" w:eastAsia="Arial" w:hAnsi="Arial"/>
+          <w:sz w:val="22"/>
+          <w:szCs w:val="22"/>
+        </w:rPr>
+        <w:t xml:space="preserve">CLAUDE.md — platform rules and constraints</w:t>
+      </w:r>
+    </w:p>
+    <w:p>
+      <w:pPr>
+        <w:pStyle w:val="ListParagraph"/>
+        <w:numPr>
+          <w:ilvl w:val="0"/>
+          <w:numId w:val="1"/>
+        </w:numPr>
+        <w:spacing w:after="80"/>
+      </w:pPr>
+      <w:r>
+        <w:rPr>
+          <w:rFonts w:ascii="Arial" w:cs="Arial" w:eastAsia="Arial" w:hAnsi="Arial"/>
+          <w:sz w:val="22"/>
+          <w:szCs w:val="22"/>
+        </w:rPr>
+        <w:t xml:space="preserve">staxai-auth.css — the single source of truth for all styling</w:t>
+      </w:r>
+    </w:p>
+    <w:p>
+      <w:pPr>
+        <w:pStyle w:val="ListParagraph"/>
+        <w:numPr>
+          <w:ilvl w:val="0"/>
+          <w:numId w:val="1"/>
+        </w:numPr>
+        <w:spacing w:after="80"/>
+      </w:pPr>
+      <w:r>
+        <w:rPr>
+          <w:rFonts w:ascii="Arial" w:cs="Arial" w:eastAsia="Arial" w:hAnsi="Arial"/>
+          <w:sz w:val="22"/>
+          <w:szCs w:val="22"/>
+        </w:rPr>
+        <w:t xml:space="preserve">shared-utils.js — shared functions that must be used</w:t>
+      </w:r>
+    </w:p>
+    <w:p>
+      <w:pPr>
+        <w:pStyle w:val="ListParagraph"/>
+        <w:numPr>
+          <w:ilvl w:val="0"/>
+          <w:numId w:val="1"/>
+        </w:numPr>
+        <w:spacing w:after="80"/>
+      </w:pPr>
+      <w:r>
+        <w:rPr>
+          <w:rFonts w:ascii="Arial" w:cs="Arial" w:eastAsia="Arial" w:hAnsi="Arial"/>
+          <w:sz w:val="22"/>
+          <w:szCs w:val="22"/>
+        </w:rPr>
+        <w:t xml:space="preserve">Page Layout Standard section in CLAUDE.md</w:t>
+      </w:r>
+    </w:p>
+    <w:p>
+      <w:pPr>
+        <w:pStyle w:val="ListParagraph"/>
+        <w:numPr>
+          <w:ilvl w:val="0"/>
+          <w:numId w:val="1"/>
+        </w:numPr>
+        <w:spacing w:after="80"/>
+      </w:pPr>
+      <w:r>
+        <w:rPr>
+          <w:rFonts w:ascii="Arial" w:cs="Arial" w:eastAsia="Arial" w:hAnsi="Arial"/>
+          <w:sz w:val="22"/>
+          <w:szCs w:val="22"/>
+        </w:rPr>
+        <w:t xml:space="preserve">Platform Audit Standard v1.4 — the checklist this tool must pass</w:t>
+      </w:r>
+    </w:p>
+    <w:p/>
+    <w:p>
+      <w:pPr>
+        <w:pStyle w:val="Heading2"/>
+        <w:spacing w:after="160" w:before="300"/>
+      </w:pPr>
+      <w:r>
+        <w:rPr>
+          <w:rFonts w:ascii="Arial" w:cs="Arial" w:eastAsia="Arial" w:hAnsi="Arial"/>
+          <w:b/>
+          <w:bCs/>
+          <w:sz w:val="26"/>
+          <w:szCs w:val="26"/>
+        </w:rPr>
+        <w:t xml:space="preserve">Architecture Requirements</w:t>
+      </w:r>
+    </w:p>
+    <w:tbl>
+      <w:tblPr>
+        <w:tblW w:type="dxa" w:w="9360"/>
+        <w:tblBorders>
+          <w:top w:val="single" w:color="auto" w:sz="4"/>
+          <w:left w:val="single" w:color="auto" w:sz="4"/>
+          <w:bottom w:val="single" w:color="auto" w:sz="4"/>
+          <w:right w:val="single" w:color="auto" w:sz="4"/>
+          <w:insideH w:val="single" w:color="auto" w:sz="4"/>
+          <w:insideV w:val="single" w:color="auto" w:sz="4"/>
+        </w:tblBorders>
+      </w:tblPr>
+      <w:tblGrid>
+        <w:gridCol w:w="3000"/>
+        <w:gridCol w:w="6360"/>
+      </w:tblGrid>
+      <w:tr>
+        <w:tc>
+          <w:tcPr>
+            <w:tcW w:type="dxa" w:w="3000"/>
+            <w:tcBorders>
+              <w:top w:val="single" w:color="CCCCCC" w:sz="1"/>
+              <w:left w:val="single" w:color="CCCCCC" w:sz="1"/>
+              <w:bottom w:val="single" w:color="CCCCCC" w:sz="1"/>
+              <w:right w:val="single" w:color="CCCCCC" w:sz="1"/>
+            </w:tcBorders>
+            <w:shd w:fill="D5E8F0" w:val="clear"/>
+            <w:tcMar>
+              <w:top w:type="dxa" w:w="80"/>
+              <w:left w:type="dxa" w:w="120"/>
+              <w:bottom w:type="dxa" w:w="80"/>
+              <w:right w:type="dxa" w:w="120"/>
+            </w:tcMar>
+          </w:tcPr>
+          <w:p>
+            <w:r>
+              <w:rPr>
+                <w:rFonts w:ascii="Arial" w:cs="Arial" w:eastAsia="Arial" w:hAnsi="Arial"/>
+                <w:b/>
+                <w:bCs/>
+                <w:sz w:val="20"/>
+                <w:szCs w:val="20"/>
+              </w:rPr>
+              <w:t xml:space="preserve">Requirement</w:t>
+            </w:r>
+          </w:p>
+        </w:tc>
+        <w:tc>
+          <w:tcPr>
+            <w:tcW w:type="dxa" w:w="6360"/>
+            <w:tcBorders>
+              <w:top w:val="single" w:color="CCCCCC" w:sz="1"/>
+              <w:left w:val="single" w:color="CCCCCC" w:sz="1"/>
+              <w:bottom w:val="single" w:color="CCCCCC" w:sz="1"/>
+              <w:right w:val="single" w:color="CCCCCC" w:sz="1"/>
+            </w:tcBorders>
+            <w:shd w:fill="D5E8F0" w:val="clear"/>
+            <w:tcMar>
+              <w:top w:type="dxa" w:w="80"/>
+              <w:left w:type="dxa" w:w="120"/>
+              <w:bottom w:type="dxa" w:w="80"/>
+              <w:right w:type="dxa" w:w="120"/>
+            </w:tcMar>
+          </w:tcPr>
+          <w:p>
+            <w:r>
+              <w:rPr>
+                <w:rFonts w:ascii="Arial" w:cs="Arial" w:eastAsia="Arial" w:hAnsi="Arial"/>
+                <w:b/>
+                <w:bCs/>
+                <w:sz w:val="20"/>
+                <w:szCs w:val="20"/>
+              </w:rPr>
+              <w:t xml:space="preserve">Detail</w:t>
+            </w:r>
+          </w:p>
+        </w:tc>
+      </w:tr>
+      <w:tr>
+        <w:tc>
+          <w:tcPr>
+            <w:tcW w:type="dxa" w:w="3000"/>
+            <w:tcBorders>
+              <w:top w:val="single" w:color="CCCCCC" w:sz="1"/>
+              <w:left w:val="single" w:color="CCCCCC" w:sz="1"/>
+              <w:bottom w:val="single" w:color="CCCCCC" w:sz="1"/>
+              <w:right w:val="single" w:color="CCCCCC" w:sz="1"/>
+            </w:tcBorders>
+            <w:tcMar>
+              <w:top w:type="dxa" w:w="80"/>
+              <w:left w:type="dxa" w:w="120"/>
+              <w:bottom w:type="dxa" w:w="80"/>
+              <w:right w:type="dxa" w:w="120"/>
+            </w:tcMar>
+          </w:tcPr>
+          <w:p>
+            <w:r>
+              <w:rPr>
+                <w:rFonts w:ascii="Arial" w:cs="Arial" w:eastAsia="Arial" w:hAnsi="Arial"/>
+                <w:sz w:val="20"/>
+                <w:szCs w:val="20"/>
+              </w:rPr>
+              <w:t xml:space="preserve">Split file architecture</w:t>
+            </w:r>
+          </w:p>
+        </w:tc>
+        <w:tc>
+          <w:tcPr>
+            <w:tcW w:type="dxa" w:w="6360"/>
+            <w:tcBorders>
+              <w:top w:val="single" w:color="CCCCCC" w:sz="1"/>
+              <w:left w:val="single" w:color="CCCCCC" w:sz="1"/>
+              <w:bottom w:val="single" w:color="CCCCCC" w:sz="1"/>
+              <w:right w:val="single" w:color="CCCCCC" w:sz="1"/>
+            </w:tcBorders>
+            <w:tcMar>
+              <w:top w:type="dxa" w:w="80"/>
+              <w:left w:type="dxa" w:w="120"/>
+              <w:bottom w:type="dxa" w:w="80"/>
+              <w:right w:type="dxa" w:w="120"/>
+            </w:tcMar>
+          </w:tcPr>
+          <w:p>
+            <w:r>
+              <w:rPr>
+                <w:rFonts w:ascii="Arial" w:cs="Arial" w:eastAsia="Arial" w:hAnsi="Arial"/>
+                <w:sz w:val="20"/>
+                <w:szCs w:val="20"/>
+              </w:rPr>
+              <w:t xml:space="preserve">[tool].html (shell + CSS), [tool]-logic.js (window.[TOOL]_LOGIC = {init()}), panel-data-[tool].js (tool panel data)</w:t>
+            </w:r>
+          </w:p>
+        </w:tc>
+      </w:tr>
+      <w:tr>
+        <w:tc>
+          <w:tcPr>
+            <w:tcW w:type="dxa" w:w="3000"/>
+            <w:tcBorders>
+              <w:top w:val="single" w:color="CCCCCC" w:sz="1"/>
+              <w:left w:val="single" w:color="CCCCCC" w:sz="1"/>
+              <w:bottom w:val="single" w:color="CCCCCC" w:sz="1"/>
+              <w:right w:val="single" w:color="CCCCCC" w:sz="1"/>
+            </w:tcBorders>
+            <w:tcMar>
+              <w:top w:type="dxa" w:w="80"/>
+              <w:left w:type="dxa" w:w="120"/>
+              <w:bottom w:type="dxa" w:w="80"/>
+              <w:right w:type="dxa" w:w="120"/>
+            </w:tcMar>
+          </w:tcPr>
+          <w:p>
+            <w:r>
+              <w:rPr>
+                <w:rFonts w:ascii="Arial" w:cs="Arial" w:eastAsia="Arial" w:hAnsi="Arial"/>
+                <w:sz w:val="20"/>
+                <w:szCs w:val="20"/>
+              </w:rPr>
+              <w:t xml:space="preserve">Maximum file size</w:t>
+            </w:r>
+          </w:p>
+        </w:tc>
+        <w:tc>
+          <w:tcPr>
+            <w:tcW w:type="dxa" w:w="6360"/>
+            <w:tcBorders>
+              <w:top w:val="single" w:color="CCCCCC" w:sz="1"/>
+              <w:left w:val="single" w:color="CCCCCC" w:sz="1"/>
+              <w:bottom w:val="single" w:color="CCCCCC" w:sz="1"/>
+              <w:right w:val="single" w:color="CCCCCC" w:sz="1"/>
+            </w:tcBorders>
+            <w:tcMar>
+              <w:top w:type="dxa" w:w="80"/>
+              <w:left w:type="dxa" w:w="120"/>
+              <w:bottom w:type="dxa" w:w="80"/>
+              <w:right w:type="dxa" w:w="120"/>
+            </w:tcMar>
+          </w:tcPr>
+          <w:p>
+            <w:r>
+              <w:rPr>
+                <w:rFonts w:ascii="Arial" w:cs="Arial" w:eastAsia="Arial" w:hAnsi="Arial"/>
+                <w:sz w:val="20"/>
+                <w:szCs w:val="20"/>
+              </w:rPr>
+              <w:t xml:space="preserve">60,000 characters per file. If [tool]-logic.js exceeds this, split into [tool]-logic.js + [tool]-modules.js</w:t>
+            </w:r>
+          </w:p>
+        </w:tc>
+      </w:tr>
+      <w:tr>
+        <w:tc>
+          <w:tcPr>
+            <w:tcW w:type="dxa" w:w="3000"/>
+            <w:tcBorders>
+              <w:top w:val="single" w:color="CCCCCC" w:sz="1"/>
+              <w:left w:val="single" w:color="CCCCCC" w:sz="1"/>
+              <w:bottom w:val="single" w:color="CCCCCC" w:sz="1"/>
+              <w:right w:val="single" w:color="CCCCCC" w:sz="1"/>
+            </w:tcBorders>
+            <w:tcMar>
+              <w:top w:type="dxa" w:w="80"/>
+              <w:left w:type="dxa" w:w="120"/>
+              <w:bottom w:type="dxa" w:w="80"/>
+              <w:right w:type="dxa" w:w="120"/>
+            </w:tcMar>
+          </w:tcPr>
+          <w:p>
+            <w:r>
+              <w:rPr>
+                <w:rFonts w:ascii="Arial" w:cs="Arial" w:eastAsia="Arial" w:hAnsi="Arial"/>
+                <w:sz w:val="20"/>
+                <w:szCs w:val="20"/>
+              </w:rPr>
+              <w:t xml:space="preserve">Topbar integration</w:t>
+            </w:r>
+          </w:p>
+        </w:tc>
+        <w:tc>
+          <w:tcPr>
+            <w:tcW w:type="dxa" w:w="6360"/>
+            <w:tcBorders>
+              <w:top w:val="single" w:color="CCCCCC" w:sz="1"/>
+              <w:left w:val="single" w:color="CCCCCC" w:sz="1"/>
+              <w:bottom w:val="single" w:color="CCCCCC" w:sz="1"/>
+              <w:right w:val="single" w:color="CCCCCC" w:sz="1"/>
+            </w:tcBorders>
+            <w:tcMar>
+              <w:top w:type="dxa" w:w="80"/>
+              <w:left w:type="dxa" w:w="120"/>
+              <w:bottom w:type="dxa" w:w="80"/>
+              <w:right w:type="dxa" w:w="120"/>
+            </w:tcMar>
+          </w:tcPr>
+          <w:p>
+            <w:r>
+              <w:rPr>
+                <w:rFonts w:ascii="Arial" w:cs="Arial" w:eastAsia="Arial" w:hAnsi="Arial"/>
+                <w:sz w:val="20"/>
+                <w:szCs w:val="20"/>
+              </w:rPr>
+              <w:t xml:space="preserve">Must use topbar.js — do not build custom navigation</w:t>
+            </w:r>
+          </w:p>
+        </w:tc>
+      </w:tr>
+      <w:tr>
+        <w:tc>
+          <w:tcPr>
+            <w:tcW w:type="dxa" w:w="3000"/>
+            <w:tcBorders>
+              <w:top w:val="single" w:color="CCCCCC" w:sz="1"/>
+              <w:left w:val="single" w:color="CCCCCC" w:sz="1"/>
+              <w:bottom w:val="single" w:color="CCCCCC" w:sz="1"/>
+              <w:right w:val="single" w:color="CCCCCC" w:sz="1"/>
+            </w:tcBorders>
+            <w:tcMar>
+              <w:top w:type="dxa" w:w="80"/>
+              <w:left w:type="dxa" w:w="120"/>
+              <w:bottom w:type="dxa" w:w="80"/>
+              <w:right w:type="dxa" w:w="120"/>
+            </w:tcMar>
+          </w:tcPr>
+          <w:p>
+            <w:r>
+              <w:rPr>
+                <w:rFonts w:ascii="Arial" w:cs="Arial" w:eastAsia="Arial" w:hAnsi="Arial"/>
+                <w:sz w:val="20"/>
+                <w:szCs w:val="20"/>
+              </w:rPr>
+              <w:t xml:space="preserve">Shared utilities</w:t>
+            </w:r>
+          </w:p>
+        </w:tc>
+        <w:tc>
+          <w:tcPr>
+            <w:tcW w:type="dxa" w:w="6360"/>
+            <w:tcBorders>
+              <w:top w:val="single" w:color="CCCCCC" w:sz="1"/>
+              <w:left w:val="single" w:color="CCCCCC" w:sz="1"/>
+              <w:bottom w:val="single" w:color="CCCCCC" w:sz="1"/>
+              <w:right w:val="single" w:color="CCCCCC" w:sz="1"/>
+            </w:tcBorders>
+            <w:tcMar>
+              <w:top w:type="dxa" w:w="80"/>
+              <w:left w:type="dxa" w:w="120"/>
+              <w:bottom w:type="dxa" w:w="80"/>
+              <w:right w:type="dxa" w:w="120"/>
+            </w:tcMar>
+          </w:tcPr>
+          <w:p>
+            <w:r>
+              <w:rPr>
+                <w:rFonts w:ascii="Arial" w:cs="Arial" w:eastAsia="Arial" w:hAnsi="Arial"/>
+                <w:sz w:val="20"/>
+                <w:szCs w:val="20"/>
+              </w:rPr>
+              <w:t xml:space="preserve">Must use shared-utils.js functions: handleSave(), escHtml(), formatDate(), etc.</w:t>
+            </w:r>
+          </w:p>
+        </w:tc>
+      </w:tr>
+      <w:tr>
+        <w:tc>
+          <w:tcPr>
+            <w:tcW w:type="dxa" w:w="3000"/>
+            <w:tcBorders>
+              <w:top w:val="single" w:color="CCCCCC" w:sz="1"/>
+              <w:left w:val="single" w:color="CCCCCC" w:sz="1"/>
+              <w:bottom w:val="single" w:color="CCCCCC" w:sz="1"/>
+              <w:right w:val="single" w:color="CCCCCC" w:sz="1"/>
+            </w:tcBorders>
+            <w:tcMar>
+              <w:top w:type="dxa" w:w="80"/>
+              <w:left w:type="dxa" w:w="120"/>
+              <w:bottom w:type="dxa" w:w="80"/>
+              <w:right w:type="dxa" w:w="120"/>
+            </w:tcMar>
+          </w:tcPr>
+          <w:p>
+            <w:r>
+              <w:rPr>
+                <w:rFonts w:ascii="Arial" w:cs="Arial" w:eastAsia="Arial" w:hAnsi="Arial"/>
+                <w:sz w:val="20"/>
+                <w:szCs w:val="20"/>
+              </w:rPr>
+              <w:t xml:space="preserve">Event handlers</w:t>
+            </w:r>
+          </w:p>
+        </w:tc>
+        <w:tc>
+          <w:tcPr>
+            <w:tcW w:type="dxa" w:w="6360"/>
+            <w:tcBorders>
+              <w:top w:val="single" w:color="CCCCCC" w:sz="1"/>
+              <w:left w:val="single" w:color="CCCCCC" w:sz="1"/>
+              <w:bottom w:val="single" w:color="CCCCCC" w:sz="1"/>
+              <w:right w:val="single" w:color="CCCCCC" w:sz="1"/>
+            </w:tcBorders>
+            <w:tcMar>
+              <w:top w:type="dxa" w:w="80"/>
+              <w:left w:type="dxa" w:w="120"/>
+              <w:bottom w:type="dxa" w:w="80"/>
+              <w:right w:type="dxa" w:w="120"/>
+            </w:tcMar>
+          </w:tcPr>
+          <w:p>
+            <w:r>
+              <w:rPr>
+                <w:rFonts w:ascii="Arial" w:cs="Arial" w:eastAsia="Arial" w:hAnsi="Arial"/>
+                <w:sz w:val="20"/>
+                <w:szCs w:val="20"/>
+              </w:rPr>
+              <w:t xml:space="preserve">addEventListener only — no inline onclick handlers</w:t>
+            </w:r>
+          </w:p>
+        </w:tc>
+      </w:tr>
+      <w:tr>
+        <w:tc>
+          <w:tcPr>
+            <w:tcW w:type="dxa" w:w="3000"/>
+            <w:tcBorders>
+              <w:top w:val="single" w:color="CCCCCC" w:sz="1"/>
+              <w:left w:val="single" w:color="CCCCCC" w:sz="1"/>
+              <w:bottom w:val="single" w:color="CCCCCC" w:sz="1"/>
+              <w:right w:val="single" w:color="CCCCCC" w:sz="1"/>
+            </w:tcBorders>
+            <w:tcMar>
+              <w:top w:type="dxa" w:w="80"/>
+              <w:left w:type="dxa" w:w="120"/>
+              <w:bottom w:type="dxa" w:w="80"/>
+              <w:right w:type="dxa" w:w="120"/>
+            </w:tcMar>
+          </w:tcPr>
+          <w:p>
+            <w:r>
+              <w:rPr>
+                <w:rFonts w:ascii="Arial" w:cs="Arial" w:eastAsia="Arial" w:hAnsi="Arial"/>
+                <w:sz w:val="20"/>
+                <w:szCs w:val="20"/>
+              </w:rPr>
+              <w:t xml:space="preserve">Australian English</w:t>
+            </w:r>
+          </w:p>
+        </w:tc>
+        <w:tc>
+          <w:tcPr>
+            <w:tcW w:type="dxa" w:w="6360"/>
+            <w:tcBorders>
+              <w:top w:val="single" w:color="CCCCCC" w:sz="1"/>
+              <w:left w:val="single" w:color="CCCCCC" w:sz="1"/>
+              <w:bottom w:val="single" w:color="CCCCCC" w:sz="1"/>
+              <w:right w:val="single" w:color="CCCCCC" w:sz="1"/>
+            </w:tcBorders>
+            <w:tcMar>
+              <w:top w:type="dxa" w:w="80"/>
+              <w:left w:type="dxa" w:w="120"/>
+              <w:bottom w:type="dxa" w:w="80"/>
+              <w:right w:type="dxa" w:w="120"/>
+            </w:tcMar>
+          </w:tcPr>
+          <w:p>
+            <w:r>
+              <w:rPr>
+                <w:rFonts w:ascii="Arial" w:cs="Arial" w:eastAsia="Arial" w:hAnsi="Arial"/>
+                <w:sz w:val="20"/>
+                <w:szCs w:val="20"/>
+              </w:rPr>
+              <w:t xml:space="preserve">colour, organisation, recognised, etc. throughout all UI copy</w:t>
+            </w:r>
+          </w:p>
+        </w:tc>
+      </w:tr>
+    </w:tbl>
+    <w:p/>
+    <w:p>
+      <w:pPr>
+        <w:pStyle w:val="Heading2"/>
+        <w:spacing w:after="160" w:before="300"/>
+      </w:pPr>
+      <w:r>
+        <w:rPr>
+          <w:rFonts w:ascii="Arial" w:cs="Arial" w:eastAsia="Arial" w:hAnsi="Arial"/>
+          <w:b/>
+          <w:bCs/>
+          <w:sz w:val="26"/>
+          <w:szCs w:val="26"/>
+        </w:rPr>
+        <w:t xml:space="preserve">Styling Requirements</w:t>
+      </w:r>
+    </w:p>
+    <w:tbl>
+      <w:tblPr>
+        <w:tblW w:type="dxa" w:w="9360"/>
+        <w:tblBorders>
+          <w:top w:val="single" w:color="auto" w:sz="4"/>
+          <w:left w:val="single" w:color="auto" w:sz="4"/>
+          <w:bottom w:val="single" w:color="auto" w:sz="4"/>
+          <w:right w:val="single" w:color="auto" w:sz="4"/>
+          <w:insideH w:val="single" w:color="auto" w:sz="4"/>
+          <w:insideV w:val="single" w:color="auto" w:sz="4"/>
+        </w:tblBorders>
+      </w:tblPr>
+      <w:tblGrid>
+        <w:gridCol w:w="3000"/>
+        <w:gridCol w:w="6360"/>
+      </w:tblGrid>
+      <w:tr>
+        <w:tc>
+          <w:tcPr>
+            <w:tcW w:type="dxa" w:w="3000"/>
+            <w:tcBorders>
+              <w:top w:val="single" w:color="CCCCCC" w:sz="1"/>
+              <w:left w:val="single" w:color="CCCCCC" w:sz="1"/>
+              <w:bottom w:val="single" w:color="CCCCCC" w:sz="1"/>
+              <w:right w:val="single" w:color="CCCCCC" w:sz="1"/>
+            </w:tcBorders>
+            <w:shd w:fill="D5E8F0" w:val="clear"/>
+            <w:tcMar>
+              <w:top w:type="dxa" w:w="80"/>
+              <w:left w:type="dxa" w:w="120"/>
+              <w:bottom w:type="dxa" w:w="80"/>
+              <w:right w:type="dxa" w:w="120"/>
+            </w:tcMar>
+          </w:tcPr>
+          <w:p>
+            <w:r>
+              <w:rPr>
+                <w:rFonts w:ascii="Arial" w:cs="Arial" w:eastAsia="Arial" w:hAnsi="Arial"/>
+                <w:b/>
+                <w:bCs/>
+                <w:sz w:val="20"/>
+                <w:szCs w:val="20"/>
+              </w:rPr>
+              <w:t xml:space="preserve">Requirement</w:t>
+            </w:r>
+          </w:p>
+        </w:tc>
+        <w:tc>
+          <w:tcPr>
+            <w:tcW w:type="dxa" w:w="6360"/>
+            <w:tcBorders>
+              <w:top w:val="single" w:color="CCCCCC" w:sz="1"/>
+              <w:left w:val="single" w:color="CCCCCC" w:sz="1"/>
+              <w:bottom w:val="single" w:color="CCCCCC" w:sz="1"/>
+              <w:right w:val="single" w:color="CCCCCC" w:sz="1"/>
+            </w:tcBorders>
+            <w:shd w:fill="D5E8F0" w:val="clear"/>
+            <w:tcMar>
+              <w:top w:type="dxa" w:w="80"/>
+              <w:left w:type="dxa" w:w="120"/>
+              <w:bottom w:type="dxa" w:w="80"/>
+              <w:right w:type="dxa" w:w="120"/>
+            </w:tcMar>
+          </w:tcPr>
+          <w:p>
+            <w:r>
+              <w:rPr>
+                <w:rFonts w:ascii="Arial" w:cs="Arial" w:eastAsia="Arial" w:hAnsi="Arial"/>
+                <w:b/>
+                <w:bCs/>
+                <w:sz w:val="20"/>
+                <w:szCs w:val="20"/>
+              </w:rPr>
+              <w:t xml:space="preserve">Detail</w:t>
+            </w:r>
+          </w:p>
+        </w:tc>
+      </w:tr>
+      <w:tr>
+        <w:tc>
+          <w:tcPr>
+            <w:tcW w:type="dxa" w:w="3000"/>
+            <w:tcBorders>
+              <w:top w:val="single" w:color="CCCCCC" w:sz="1"/>
+              <w:left w:val="single" w:color="CCCCCC" w:sz="1"/>
+              <w:bottom w:val="single" w:color="CCCCCC" w:sz="1"/>
+              <w:right w:val="single" w:color="CCCCCC" w:sz="1"/>
+            </w:tcBorders>
+            <w:tcMar>
+              <w:top w:type="dxa" w:w="80"/>
+              <w:left w:type="dxa" w:w="120"/>
+              <w:bottom w:type="dxa" w:w="80"/>
+              <w:right w:type="dxa" w:w="120"/>
+            </w:tcMar>
+          </w:tcPr>
+          <w:p>
+            <w:r>
+              <w:rPr>
+                <w:rFonts w:ascii="Arial" w:cs="Arial" w:eastAsia="Arial" w:hAnsi="Arial"/>
+                <w:sz w:val="20"/>
+                <w:szCs w:val="20"/>
+              </w:rPr>
+              <w:t xml:space="preserve">CSS source</w:t>
+            </w:r>
+          </w:p>
+        </w:tc>
+        <w:tc>
+          <w:tcPr>
+            <w:tcW w:type="dxa" w:w="6360"/>
+            <w:tcBorders>
+              <w:top w:val="single" w:color="CCCCCC" w:sz="1"/>
+              <w:left w:val="single" w:color="CCCCCC" w:sz="1"/>
+              <w:bottom w:val="single" w:color="CCCCCC" w:sz="1"/>
+              <w:right w:val="single" w:color="CCCCCC" w:sz="1"/>
+            </w:tcBorders>
+            <w:tcMar>
+              <w:top w:type="dxa" w:w="80"/>
+              <w:left w:type="dxa" w:w="120"/>
+              <w:bottom w:type="dxa" w:w="80"/>
+              <w:right w:type="dxa" w:w="120"/>
+            </w:tcMar>
+          </w:tcPr>
+          <w:p>
+            <w:r>
+              <w:rPr>
+                <w:rFonts w:ascii="Arial" w:cs="Arial" w:eastAsia="Arial" w:hAnsi="Arial"/>
+                <w:sz w:val="20"/>
+                <w:szCs w:val="20"/>
+              </w:rPr>
+              <w:t xml:space="preserve">staxai-auth.css is the single source of truth. Load it first.</w:t>
+            </w:r>
+          </w:p>
+        </w:tc>
+      </w:tr>
+      <w:tr>
+        <w:tc>
+          <w:tcPr>
+            <w:tcW w:type="dxa" w:w="3000"/>
+            <w:tcBorders>
+              <w:top w:val="single" w:color="CCCCCC" w:sz="1"/>
+              <w:left w:val="single" w:color="CCCCCC" w:sz="1"/>
+              <w:bottom w:val="single" w:color="CCCCCC" w:sz="1"/>
+              <w:right w:val="single" w:color="CCCCCC" w:sz="1"/>
+            </w:tcBorders>
+            <w:tcMar>
+              <w:top w:type="dxa" w:w="80"/>
+              <w:left w:type="dxa" w:w="120"/>
+              <w:bottom w:type="dxa" w:w="80"/>
+              <w:right w:type="dxa" w:w="120"/>
+            </w:tcMar>
+          </w:tcPr>
+          <w:p>
+            <w:r>
+              <w:rPr>
+                <w:rFonts w:ascii="Arial" w:cs="Arial" w:eastAsia="Arial" w:hAnsi="Arial"/>
+                <w:sz w:val="20"/>
+                <w:szCs w:val="20"/>
+              </w:rPr>
+              <w:t xml:space="preserve">Colours</w:t>
+            </w:r>
+          </w:p>
+        </w:tc>
+        <w:tc>
+          <w:tcPr>
+            <w:tcW w:type="dxa" w:w="6360"/>
+            <w:tcBorders>
+              <w:top w:val="single" w:color="CCCCCC" w:sz="1"/>
+              <w:left w:val="single" w:color="CCCCCC" w:sz="1"/>
+              <w:bottom w:val="single" w:color="CCCCCC" w:sz="1"/>
+              <w:right w:val="single" w:color="CCCCCC" w:sz="1"/>
+            </w:tcBorders>
+            <w:tcMar>
+              <w:top w:type="dxa" w:w="80"/>
+              <w:left w:type="dxa" w:w="120"/>
+              <w:bottom w:type="dxa" w:w="80"/>
+              <w:right w:type="dxa" w:w="120"/>
+            </w:tcMar>
+          </w:tcPr>
+          <w:p>
+            <w:r>
+              <w:rPr>
+                <w:rFonts w:ascii="Arial" w:cs="Arial" w:eastAsia="Arial" w:hAnsi="Arial"/>
+                <w:sz w:val="20"/>
+                <w:szCs w:val="20"/>
+              </w:rPr>
+              <w:t xml:space="preserve">CSS variables only. Primary: var(--stax-primary) = #4A6D8C. Never hardcode colours.</w:t>
+            </w:r>
+          </w:p>
+        </w:tc>
+      </w:tr>
+      <w:tr>
+        <w:tc>
+          <w:tcPr>
+            <w:tcW w:type="dxa" w:w="3000"/>
+            <w:tcBorders>
+              <w:top w:val="single" w:color="CCCCCC" w:sz="1"/>
+              <w:left w:val="single" w:color="CCCCCC" w:sz="1"/>
+              <w:bottom w:val="single" w:color="CCCCCC" w:sz="1"/>
+              <w:right w:val="single" w:color="CCCCCC" w:sz="1"/>
+            </w:tcBorders>
+            <w:tcMar>
+              <w:top w:type="dxa" w:w="80"/>
+              <w:left w:type="dxa" w:w="120"/>
+              <w:bottom w:type="dxa" w:w="80"/>
+              <w:right w:type="dxa" w:w="120"/>
+            </w:tcMar>
+          </w:tcPr>
+          <w:p>
+            <w:r>
+              <w:rPr>
+                <w:rFonts w:ascii="Arial" w:cs="Arial" w:eastAsia="Arial" w:hAnsi="Arial"/>
+                <w:sz w:val="20"/>
+                <w:szCs w:val="20"/>
+              </w:rPr>
+              <w:t xml:space="preserve">New classes</w:t>
+            </w:r>
+          </w:p>
+        </w:tc>
+        <w:tc>
+          <w:tcPr>
+            <w:tcW w:type="dxa" w:w="6360"/>
+            <w:tcBorders>
+              <w:top w:val="single" w:color="CCCCCC" w:sz="1"/>
+              <w:left w:val="single" w:color="CCCCCC" w:sz="1"/>
+              <w:bottom w:val="single" w:color="CCCCCC" w:sz="1"/>
+              <w:right w:val="single" w:color="CCCCCC" w:sz="1"/>
+            </w:tcBorders>
+            <w:tcMar>
+              <w:top w:type="dxa" w:w="80"/>
+              <w:left w:type="dxa" w:w="120"/>
+              <w:bottom w:type="dxa" w:w="80"/>
+              <w:right w:type="dxa" w:w="120"/>
+            </w:tcMar>
+          </w:tcPr>
+          <w:p>
+            <w:r>
+              <w:rPr>
+                <w:rFonts w:ascii="Arial" w:cs="Arial" w:eastAsia="Arial" w:hAnsi="Arial"/>
+                <w:sz w:val="20"/>
+                <w:szCs w:val="20"/>
+              </w:rPr>
+              <w:t xml:space="preserve">DO NOT create new classes in staxai-auth.css without explicit owner permission.</w:t>
+            </w:r>
+          </w:p>
+        </w:tc>
+      </w:tr>
+      <w:tr>
+        <w:tc>
+          <w:tcPr>
+            <w:tcW w:type="dxa" w:w="3000"/>
+            <w:tcBorders>
+              <w:top w:val="single" w:color="CCCCCC" w:sz="1"/>
+              <w:left w:val="single" w:color="CCCCCC" w:sz="1"/>
+              <w:bottom w:val="single" w:color="CCCCCC" w:sz="1"/>
+              <w:right w:val="single" w:color="CCCCCC" w:sz="1"/>
+            </w:tcBorders>
+            <w:tcMar>
+              <w:top w:type="dxa" w:w="80"/>
+              <w:left w:type="dxa" w:w="120"/>
+              <w:bottom w:type="dxa" w:w="80"/>
+              <w:right w:type="dxa" w:w="120"/>
+            </w:tcMar>
+          </w:tcPr>
+          <w:p>
+            <w:r>
+              <w:rPr>
+                <w:rFonts w:ascii="Arial" w:cs="Arial" w:eastAsia="Arial" w:hAnsi="Arial"/>
+                <w:sz w:val="20"/>
+                <w:szCs w:val="20"/>
+              </w:rPr>
+              <w:t xml:space="preserve">Missing styles</w:t>
+            </w:r>
+          </w:p>
+        </w:tc>
+        <w:tc>
+          <w:tcPr>
+            <w:tcW w:type="dxa" w:w="6360"/>
+            <w:tcBorders>
+              <w:top w:val="single" w:color="CCCCCC" w:sz="1"/>
+              <w:left w:val="single" w:color="CCCCCC" w:sz="1"/>
+              <w:bottom w:val="single" w:color="CCCCCC" w:sz="1"/>
+              <w:right w:val="single" w:color="CCCCCC" w:sz="1"/>
+            </w:tcBorders>
+            <w:tcMar>
+              <w:top w:type="dxa" w:w="80"/>
+              <w:left w:type="dxa" w:w="120"/>
+              <w:bottom w:type="dxa" w:w="80"/>
+              <w:right w:type="dxa" w:w="120"/>
+            </w:tcMar>
+          </w:tcPr>
+          <w:p>
+            <w:r>
+              <w:rPr>
+                <w:rFonts w:ascii="Arial" w:cs="Arial" w:eastAsia="Arial" w:hAnsi="Arial"/>
+                <w:sz w:val="20"/>
+                <w:szCs w:val="20"/>
+              </w:rPr>
+              <w:t xml:space="preserve">If a required style doesn’t exist, STOP and report back. Do not invent classes.</w:t>
+            </w:r>
+          </w:p>
+        </w:tc>
+      </w:tr>
+      <w:tr>
+        <w:tc>
+          <w:tcPr>
+            <w:tcW w:type="dxa" w:w="3000"/>
+            <w:tcBorders>
+              <w:top w:val="single" w:color="CCCCCC" w:sz="1"/>
+              <w:left w:val="single" w:color="CCCCCC" w:sz="1"/>
+              <w:bottom w:val="single" w:color="CCCCCC" w:sz="1"/>
+              <w:right w:val="single" w:color="CCCCCC" w:sz="1"/>
+            </w:tcBorders>
+            <w:tcMar>
+              <w:top w:type="dxa" w:w="80"/>
+              <w:left w:type="dxa" w:w="120"/>
+              <w:bottom w:type="dxa" w:w="80"/>
+              <w:right w:type="dxa" w:w="120"/>
+            </w:tcMar>
+          </w:tcPr>
+          <w:p>
+            <w:r>
+              <w:rPr>
+                <w:rFonts w:ascii="Arial" w:cs="Arial" w:eastAsia="Arial" w:hAnsi="Arial"/>
+                <w:sz w:val="20"/>
+                <w:szCs w:val="20"/>
+              </w:rPr>
+              <w:t xml:space="preserve">Component patterns</w:t>
+            </w:r>
+          </w:p>
+        </w:tc>
+        <w:tc>
+          <w:tcPr>
+            <w:tcW w:type="dxa" w:w="6360"/>
+            <w:tcBorders>
+              <w:top w:val="single" w:color="CCCCCC" w:sz="1"/>
+              <w:left w:val="single" w:color="CCCCCC" w:sz="1"/>
+              <w:bottom w:val="single" w:color="CCCCCC" w:sz="1"/>
+              <w:right w:val="single" w:color="CCCCCC" w:sz="1"/>
+            </w:tcBorders>
+            <w:tcMar>
+              <w:top w:type="dxa" w:w="80"/>
+              <w:left w:type="dxa" w:w="120"/>
+              <w:bottom w:type="dxa" w:w="80"/>
+              <w:right w:type="dxa" w:w="120"/>
+            </w:tcMar>
+          </w:tcPr>
+          <w:p>
+            <w:r>
+              <w:rPr>
+                <w:rFonts w:ascii="Arial" w:cs="Arial" w:eastAsia="Arial" w:hAnsi="Arial"/>
+                <w:sz w:val="20"/>
+                <w:szCs w:val="20"/>
+              </w:rPr>
+              <w:t xml:space="preserve">Match existing CL/EA/ID implementations exactly for dropdowns, tabs, cards, modals.</w:t>
+            </w:r>
+          </w:p>
+        </w:tc>
+      </w:tr>
+    </w:tbl>
+    <w:p/>
+    <w:p>
+      <w:pPr>
+        <w:spacing w:after="120"/>
+      </w:pPr>
+      <w:r>
+        <w:rPr>
+          <w:rFonts w:ascii="Arial" w:cs="Arial" w:eastAsia="Arial" w:hAnsi="Arial"/>
+          <w:b/>
+          <w:bCs/>
+          <w:sz w:val="22"/>
+          <w:szCs w:val="22"/>
+        </w:rPr>
+        <w:t xml:space="preserve">WARNING: If Code needs a CSS class, component, or pattern that doesn’t exist in staxai-auth.css, Code must STOP and report back. The owner and Chat will decide whether to add it to the stylesheet or find an existing solution. Code does not create new classes independently.</w:t>
+      </w:r>
+    </w:p>
+    <w:p/>
+    <w:p>
+      <w:pPr>
+        <w:pStyle w:val="Heading2"/>
+        <w:spacing w:after="160" w:before="300"/>
+      </w:pPr>
+      <w:r>
+        <w:rPr>
+          <w:rFonts w:ascii="Arial" w:cs="Arial" w:eastAsia="Arial" w:hAnsi="Arial"/>
+          <w:b/>
+          <w:bCs/>
+          <w:sz w:val="26"/>
+          <w:szCs w:val="26"/>
+        </w:rPr>
+        <w:t xml:space="preserve">API Requirements</w:t>
+      </w:r>
+    </w:p>
+    <w:tbl>
+      <w:tblPr>
+        <w:tblW w:type="dxa" w:w="9360"/>
+        <w:tblBorders>
+          <w:top w:val="single" w:color="auto" w:sz="4"/>
+          <w:left w:val="single" w:color="auto" w:sz="4"/>
+          <w:bottom w:val="single" w:color="auto" w:sz="4"/>
+          <w:right w:val="single" w:color="auto" w:sz="4"/>
+          <w:insideH w:val="single" w:color="auto" w:sz="4"/>
+          <w:insideV w:val="single" w:color="auto" w:sz="4"/>
+        </w:tblBorders>
+      </w:tblPr>
+      <w:tblGrid>
+        <w:gridCol w:w="3000"/>
+        <w:gridCol w:w="6360"/>
+      </w:tblGrid>
+      <w:tr>
+        <w:tc>
+          <w:tcPr>
+            <w:tcW w:type="dxa" w:w="3000"/>
+            <w:tcBorders>
+              <w:top w:val="single" w:color="CCCCCC" w:sz="1"/>
+              <w:left w:val="single" w:color="CCCCCC" w:sz="1"/>
+              <w:bottom w:val="single" w:color="CCCCCC" w:sz="1"/>
+              <w:right w:val="single" w:color="CCCCCC" w:sz="1"/>
+            </w:tcBorders>
+            <w:shd w:fill="D5E8F0" w:val="clear"/>
+            <w:tcMar>
+              <w:top w:type="dxa" w:w="80"/>
+              <w:left w:type="dxa" w:w="120"/>
+              <w:bottom w:type="dxa" w:w="80"/>
+              <w:right w:type="dxa" w:w="120"/>
+            </w:tcMar>
+          </w:tcPr>
+          <w:p>
+            <w:r>
+              <w:rPr>
+                <w:rFonts w:ascii="Arial" w:cs="Arial" w:eastAsia="Arial" w:hAnsi="Arial"/>
+                <w:b/>
+                <w:bCs/>
+                <w:sz w:val="20"/>
+                <w:szCs w:val="20"/>
+              </w:rPr>
+              <w:t xml:space="preserve">Requirement</w:t>
+            </w:r>
+          </w:p>
+        </w:tc>
+        <w:tc>
+          <w:tcPr>
+            <w:tcW w:type="dxa" w:w="6360"/>
+            <w:tcBorders>
+              <w:top w:val="single" w:color="CCCCCC" w:sz="1"/>
+              <w:left w:val="single" w:color="CCCCCC" w:sz="1"/>
+              <w:bottom w:val="single" w:color="CCCCCC" w:sz="1"/>
+              <w:right w:val="single" w:color="CCCCCC" w:sz="1"/>
+            </w:tcBorders>
+            <w:shd w:fill="D5E8F0" w:val="clear"/>
+            <w:tcMar>
+              <w:top w:type="dxa" w:w="80"/>
+              <w:left w:type="dxa" w:w="120"/>
+              <w:bottom w:type="dxa" w:w="80"/>
+              <w:right w:type="dxa" w:w="120"/>
+            </w:tcMar>
+          </w:tcPr>
+          <w:p>
+            <w:r>
+              <w:rPr>
+                <w:rFonts w:ascii="Arial" w:cs="Arial" w:eastAsia="Arial" w:hAnsi="Arial"/>
+                <w:b/>
+                <w:bCs/>
+                <w:sz w:val="20"/>
+                <w:szCs w:val="20"/>
+              </w:rPr>
+              <w:t xml:space="preserve">Detail</w:t>
+            </w:r>
+          </w:p>
+        </w:tc>
+      </w:tr>
+      <w:tr>
+        <w:tc>
+          <w:tcPr>
+            <w:tcW w:type="dxa" w:w="3000"/>
+            <w:tcBorders>
+              <w:top w:val="single" w:color="CCCCCC" w:sz="1"/>
+              <w:left w:val="single" w:color="CCCCCC" w:sz="1"/>
+              <w:bottom w:val="single" w:color="CCCCCC" w:sz="1"/>
+              <w:right w:val="single" w:color="CCCCCC" w:sz="1"/>
+            </w:tcBorders>
+            <w:tcMar>
+              <w:top w:type="dxa" w:w="80"/>
+              <w:left w:type="dxa" w:w="120"/>
+              <w:bottom w:type="dxa" w:w="80"/>
+              <w:right w:type="dxa" w:w="120"/>
+            </w:tcMar>
+          </w:tcPr>
+          <w:p>
+            <w:r>
+              <w:rPr>
+                <w:rFonts w:ascii="Arial" w:cs="Arial" w:eastAsia="Arial" w:hAnsi="Arial"/>
+                <w:sz w:val="20"/>
+                <w:szCs w:val="20"/>
+              </w:rPr>
+              <w:t xml:space="preserve">All AI calls</w:t>
+            </w:r>
+          </w:p>
+        </w:tc>
+        <w:tc>
+          <w:tcPr>
+            <w:tcW w:type="dxa" w:w="6360"/>
+            <w:tcBorders>
+              <w:top w:val="single" w:color="CCCCCC" w:sz="1"/>
+              <w:left w:val="single" w:color="CCCCCC" w:sz="1"/>
+              <w:bottom w:val="single" w:color="CCCCCC" w:sz="1"/>
+              <w:right w:val="single" w:color="CCCCCC" w:sz="1"/>
+            </w:tcBorders>
+            <w:tcMar>
+              <w:top w:type="dxa" w:w="80"/>
+              <w:left w:type="dxa" w:w="120"/>
+              <w:bottom w:type="dxa" w:w="80"/>
+              <w:right w:type="dxa" w:w="120"/>
+            </w:tcMar>
+          </w:tcPr>
+          <w:p>
+            <w:r>
+              <w:rPr>
+                <w:rFonts w:ascii="Arial" w:cs="Arial" w:eastAsia="Arial" w:hAnsi="Arial"/>
+                <w:sz w:val="20"/>
+                <w:szCs w:val="20"/>
+              </w:rPr>
+              <w:t xml:space="preserve">Server-side only via Vercel functions in api/ folder</w:t>
+            </w:r>
+          </w:p>
+        </w:tc>
+      </w:tr>
+      <w:tr>
+        <w:tc>
+          <w:tcPr>
+            <w:tcW w:type="dxa" w:w="3000"/>
+            <w:tcBorders>
+              <w:top w:val="single" w:color="CCCCCC" w:sz="1"/>
+              <w:left w:val="single" w:color="CCCCCC" w:sz="1"/>
+              <w:bottom w:val="single" w:color="CCCCCC" w:sz="1"/>
+              <w:right w:val="single" w:color="CCCCCC" w:sz="1"/>
+            </w:tcBorders>
+            <w:tcMar>
+              <w:top w:type="dxa" w:w="80"/>
+              <w:left w:type="dxa" w:w="120"/>
+              <w:bottom w:type="dxa" w:w="80"/>
+              <w:right w:type="dxa" w:w="120"/>
+            </w:tcMar>
+          </w:tcPr>
+          <w:p>
+            <w:r>
+              <w:rPr>
+                <w:rFonts w:ascii="Arial" w:cs="Arial" w:eastAsia="Arial" w:hAnsi="Arial"/>
+                <w:sz w:val="20"/>
+                <w:szCs w:val="20"/>
+              </w:rPr>
+              <w:t xml:space="preserve">Model</w:t>
+            </w:r>
+          </w:p>
+        </w:tc>
+        <w:tc>
+          <w:tcPr>
+            <w:tcW w:type="dxa" w:w="6360"/>
+            <w:tcBorders>
+              <w:top w:val="single" w:color="CCCCCC" w:sz="1"/>
+              <w:left w:val="single" w:color="CCCCCC" w:sz="1"/>
+              <w:bottom w:val="single" w:color="CCCCCC" w:sz="1"/>
+              <w:right w:val="single" w:color="CCCCCC" w:sz="1"/>
+            </w:tcBorders>
+            <w:tcMar>
+              <w:top w:type="dxa" w:w="80"/>
+              <w:left w:type="dxa" w:w="120"/>
+              <w:bottom w:type="dxa" w:w="80"/>
+              <w:right w:type="dxa" w:w="120"/>
+            </w:tcMar>
+          </w:tcPr>
+          <w:p>
+            <w:r>
+              <w:rPr>
+                <w:rFonts w:ascii="Arial" w:cs="Arial" w:eastAsia="Arial" w:hAnsi="Arial"/>
+                <w:sz w:val="20"/>
+                <w:szCs w:val="20"/>
+              </w:rPr>
+              <w:t xml:space="preserve">claude-sonnet-4-6 for customer-facing outputs</w:t>
+            </w:r>
+          </w:p>
+        </w:tc>
+      </w:tr>
+      <w:tr>
+        <w:tc>
+          <w:tcPr>
+            <w:tcW w:type="dxa" w:w="3000"/>
+            <w:tcBorders>
+              <w:top w:val="single" w:color="CCCCCC" w:sz="1"/>
+              <w:left w:val="single" w:color="CCCCCC" w:sz="1"/>
+              <w:bottom w:val="single" w:color="CCCCCC" w:sz="1"/>
+              <w:right w:val="single" w:color="CCCCCC" w:sz="1"/>
+            </w:tcBorders>
+            <w:tcMar>
+              <w:top w:type="dxa" w:w="80"/>
+              <w:left w:type="dxa" w:w="120"/>
+              <w:bottom w:type="dxa" w:w="80"/>
+              <w:right w:type="dxa" w:w="120"/>
+            </w:tcMar>
+          </w:tcPr>
+          <w:p>
+            <w:r>
+              <w:rPr>
+                <w:rFonts w:ascii="Arial" w:cs="Arial" w:eastAsia="Arial" w:hAnsi="Arial"/>
+                <w:sz w:val="20"/>
+                <w:szCs w:val="20"/>
+              </w:rPr>
+              <w:t xml:space="preserve">Authentication</w:t>
+            </w:r>
+          </w:p>
+        </w:tc>
+        <w:tc>
+          <w:tcPr>
+            <w:tcW w:type="dxa" w:w="6360"/>
+            <w:tcBorders>
+              <w:top w:val="single" w:color="CCCCCC" w:sz="1"/>
+              <w:left w:val="single" w:color="CCCCCC" w:sz="1"/>
+              <w:bottom w:val="single" w:color="CCCCCC" w:sz="1"/>
+              <w:right w:val="single" w:color="CCCCCC" w:sz="1"/>
+            </w:tcBorders>
+            <w:tcMar>
+              <w:top w:type="dxa" w:w="80"/>
+              <w:left w:type="dxa" w:w="120"/>
+              <w:bottom w:type="dxa" w:w="80"/>
+              <w:right w:type="dxa" w:w="120"/>
+            </w:tcMar>
+          </w:tcPr>
+          <w:p>
+            <w:r>
+              <w:rPr>
+                <w:rFonts w:ascii="Arial" w:cs="Arial" w:eastAsia="Arial" w:hAnsi="Arial"/>
+                <w:sz w:val="20"/>
+                <w:szCs w:val="20"/>
+              </w:rPr>
+              <w:t xml:space="preserve">JWT Bearer token + supabase.auth.getUser() on every endpoint</w:t>
+            </w:r>
+          </w:p>
+        </w:tc>
+      </w:tr>
+      <w:tr>
+        <w:tc>
+          <w:tcPr>
+            <w:tcW w:type="dxa" w:w="3000"/>
+            <w:tcBorders>
+              <w:top w:val="single" w:color="CCCCCC" w:sz="1"/>
+              <w:left w:val="single" w:color="CCCCCC" w:sz="1"/>
+              <w:bottom w:val="single" w:color="CCCCCC" w:sz="1"/>
+              <w:right w:val="single" w:color="CCCCCC" w:sz="1"/>
+            </w:tcBorders>
+            <w:tcMar>
+              <w:top w:type="dxa" w:w="80"/>
+              <w:left w:type="dxa" w:w="120"/>
+              <w:bottom w:type="dxa" w:w="80"/>
+              <w:right w:type="dxa" w:w="120"/>
+            </w:tcMar>
+          </w:tcPr>
+          <w:p>
+            <w:r>
+              <w:rPr>
+                <w:rFonts w:ascii="Arial" w:cs="Arial" w:eastAsia="Arial" w:hAnsi="Arial"/>
+                <w:sz w:val="20"/>
+                <w:szCs w:val="20"/>
+              </w:rPr>
+              <w:t xml:space="preserve">Error handling</w:t>
+            </w:r>
+          </w:p>
+        </w:tc>
+        <w:tc>
+          <w:tcPr>
+            <w:tcW w:type="dxa" w:w="6360"/>
+            <w:tcBorders>
+              <w:top w:val="single" w:color="CCCCCC" w:sz="1"/>
+              <w:left w:val="single" w:color="CCCCCC" w:sz="1"/>
+              <w:bottom w:val="single" w:color="CCCCCC" w:sz="1"/>
+              <w:right w:val="single" w:color="CCCCCC" w:sz="1"/>
+            </w:tcBorders>
+            <w:tcMar>
+              <w:top w:type="dxa" w:w="80"/>
+              <w:left w:type="dxa" w:w="120"/>
+              <w:bottom w:type="dxa" w:w="80"/>
+              <w:right w:type="dxa" w:w="120"/>
+            </w:tcMar>
+          </w:tcPr>
+          <w:p>
+            <w:r>
+              <w:rPr>
+                <w:rFonts w:ascii="Arial" w:cs="Arial" w:eastAsia="Arial" w:hAnsi="Arial"/>
+                <w:sz w:val="20"/>
+                <w:szCs w:val="20"/>
+              </w:rPr>
+              <w:t xml:space="preserve">Modal error display using platform pattern — no console.log for user-facing errors</w:t>
+            </w:r>
+          </w:p>
+        </w:tc>
+      </w:tr>
+      <w:tr>
+        <w:tc>
+          <w:tcPr>
+            <w:tcW w:type="dxa" w:w="3000"/>
+            <w:tcBorders>
+              <w:top w:val="single" w:color="CCCCCC" w:sz="1"/>
+              <w:left w:val="single" w:color="CCCCCC" w:sz="1"/>
+              <w:bottom w:val="single" w:color="CCCCCC" w:sz="1"/>
+              <w:right w:val="single" w:color="CCCCCC" w:sz="1"/>
+            </w:tcBorders>
+            <w:tcMar>
+              <w:top w:type="dxa" w:w="80"/>
+              <w:left w:type="dxa" w:w="120"/>
+              <w:bottom w:type="dxa" w:w="80"/>
+              <w:right w:type="dxa" w:w="120"/>
+            </w:tcMar>
+          </w:tcPr>
+          <w:p>
+            <w:r>
+              <w:rPr>
+                <w:rFonts w:ascii="Arial" w:cs="Arial" w:eastAsia="Arial" w:hAnsi="Arial"/>
+                <w:sz w:val="20"/>
+                <w:szCs w:val="20"/>
+              </w:rPr>
+              <w:t xml:space="preserve">API keys</w:t>
+            </w:r>
+          </w:p>
+        </w:tc>
+        <w:tc>
+          <w:tcPr>
+            <w:tcW w:type="dxa" w:w="6360"/>
+            <w:tcBorders>
+              <w:top w:val="single" w:color="CCCCCC" w:sz="1"/>
+              <w:left w:val="single" w:color="CCCCCC" w:sz="1"/>
+              <w:bottom w:val="single" w:color="CCCCCC" w:sz="1"/>
+              <w:right w:val="single" w:color="CCCCCC" w:sz="1"/>
+            </w:tcBorders>
+            <w:tcMar>
+              <w:top w:type="dxa" w:w="80"/>
+              <w:left w:type="dxa" w:w="120"/>
+              <w:bottom w:type="dxa" w:w="80"/>
+              <w:right w:type="dxa" w:w="120"/>
+            </w:tcMar>
+          </w:tcPr>
+          <w:p>
+            <w:r>
+              <w:rPr>
+                <w:rFonts w:ascii="Arial" w:cs="Arial" w:eastAsia="Arial" w:hAnsi="Arial"/>
+                <w:sz w:val="20"/>
+                <w:szCs w:val="20"/>
+              </w:rPr>
+              <w:t xml:space="preserve">Never expose to browser. All keys server-side only.</w:t>
+            </w:r>
+          </w:p>
+        </w:tc>
+      </w:tr>
+    </w:tbl>
+    <w:p/>
+    <w:p>
+      <w:pPr>
+        <w:pStyle w:val="Heading2"/>
+        <w:spacing w:after="160" w:before="300"/>
+      </w:pPr>
+      <w:r>
+        <w:rPr>
+          <w:rFonts w:ascii="Arial" w:cs="Arial" w:eastAsia="Arial" w:hAnsi="Arial"/>
+          <w:b/>
+          <w:bCs/>
+          <w:sz w:val="26"/>
+          <w:szCs w:val="26"/>
+        </w:rPr>
+        <w:t xml:space="preserve">Database Requirements</w:t>
+      </w:r>
+    </w:p>
+    <w:tbl>
+      <w:tblPr>
+        <w:tblW w:type="dxa" w:w="9360"/>
+        <w:tblBorders>
+          <w:top w:val="single" w:color="auto" w:sz="4"/>
+          <w:left w:val="single" w:color="auto" w:sz="4"/>
+          <w:bottom w:val="single" w:color="auto" w:sz="4"/>
+          <w:right w:val="single" w:color="auto" w:sz="4"/>
+          <w:insideH w:val="single" w:color="auto" w:sz="4"/>
+          <w:insideV w:val="single" w:color="auto" w:sz="4"/>
+        </w:tblBorders>
+      </w:tblPr>
+      <w:tblGrid>
+        <w:gridCol w:w="3000"/>
+        <w:gridCol w:w="6360"/>
+      </w:tblGrid>
+      <w:tr>
+        <w:tc>
+          <w:tcPr>
+            <w:tcW w:type="dxa" w:w="3000"/>
+            <w:tcBorders>
+              <w:top w:val="single" w:color="CCCCCC" w:sz="1"/>
+              <w:left w:val="single" w:color="CCCCCC" w:sz="1"/>
+              <w:bottom w:val="single" w:color="CCCCCC" w:sz="1"/>
+              <w:right w:val="single" w:color="CCCCCC" w:sz="1"/>
+            </w:tcBorders>
+            <w:shd w:fill="D5E8F0" w:val="clear"/>
+            <w:tcMar>
+              <w:top w:type="dxa" w:w="80"/>
+              <w:left w:type="dxa" w:w="120"/>
+              <w:bottom w:type="dxa" w:w="80"/>
+              <w:right w:type="dxa" w:w="120"/>
+            </w:tcMar>
+          </w:tcPr>
+          <w:p>
+            <w:r>
+              <w:rPr>
+                <w:rFonts w:ascii="Arial" w:cs="Arial" w:eastAsia="Arial" w:hAnsi="Arial"/>
+                <w:b/>
+                <w:bCs/>
+                <w:sz w:val="20"/>
+                <w:szCs w:val="20"/>
+              </w:rPr>
+              <w:t xml:space="preserve">Requirement</w:t>
+            </w:r>
+          </w:p>
+        </w:tc>
+        <w:tc>
+          <w:tcPr>
+            <w:tcW w:type="dxa" w:w="6360"/>
+            <w:tcBorders>
+              <w:top w:val="single" w:color="CCCCCC" w:sz="1"/>
+              <w:left w:val="single" w:color="CCCCCC" w:sz="1"/>
+              <w:bottom w:val="single" w:color="CCCCCC" w:sz="1"/>
+              <w:right w:val="single" w:color="CCCCCC" w:sz="1"/>
+            </w:tcBorders>
+            <w:shd w:fill="D5E8F0" w:val="clear"/>
+            <w:tcMar>
+              <w:top w:type="dxa" w:w="80"/>
+              <w:left w:type="dxa" w:w="120"/>
+              <w:bottom w:type="dxa" w:w="80"/>
+              <w:right w:type="dxa" w:w="120"/>
+            </w:tcMar>
+          </w:tcPr>
+          <w:p>
+            <w:r>
+              <w:rPr>
+                <w:rFonts w:ascii="Arial" w:cs="Arial" w:eastAsia="Arial" w:hAnsi="Arial"/>
+                <w:b/>
+                <w:bCs/>
+                <w:sz w:val="20"/>
+                <w:szCs w:val="20"/>
+              </w:rPr>
+              <w:t xml:space="preserve">Detail</w:t>
+            </w:r>
+          </w:p>
+        </w:tc>
+      </w:tr>
+      <w:tr>
+        <w:tc>
+          <w:tcPr>
+            <w:tcW w:type="dxa" w:w="3000"/>
+            <w:tcBorders>
+              <w:top w:val="single" w:color="CCCCCC" w:sz="1"/>
+              <w:left w:val="single" w:color="CCCCCC" w:sz="1"/>
+              <w:bottom w:val="single" w:color="CCCCCC" w:sz="1"/>
+              <w:right w:val="single" w:color="CCCCCC" w:sz="1"/>
+            </w:tcBorders>
+            <w:tcMar>
+              <w:top w:type="dxa" w:w="80"/>
+              <w:left w:type="dxa" w:w="120"/>
+              <w:bottom w:type="dxa" w:w="80"/>
+              <w:right w:type="dxa" w:w="120"/>
+            </w:tcMar>
+          </w:tcPr>
+          <w:p>
+            <w:r>
+              <w:rPr>
+                <w:rFonts w:ascii="Arial" w:cs="Arial" w:eastAsia="Arial" w:hAnsi="Arial"/>
+                <w:sz w:val="20"/>
+                <w:szCs w:val="20"/>
+              </w:rPr>
+              <w:t xml:space="preserve">New tables</w:t>
+            </w:r>
+          </w:p>
+        </w:tc>
+        <w:tc>
+          <w:tcPr>
+            <w:tcW w:type="dxa" w:w="6360"/>
+            <w:tcBorders>
+              <w:top w:val="single" w:color="CCCCCC" w:sz="1"/>
+              <w:left w:val="single" w:color="CCCCCC" w:sz="1"/>
+              <w:bottom w:val="single" w:color="CCCCCC" w:sz="1"/>
+              <w:right w:val="single" w:color="CCCCCC" w:sz="1"/>
+            </w:tcBorders>
+            <w:tcMar>
+              <w:top w:type="dxa" w:w="80"/>
+              <w:left w:type="dxa" w:w="120"/>
+              <w:bottom w:type="dxa" w:w="80"/>
+              <w:right w:type="dxa" w:w="120"/>
+            </w:tcMar>
+          </w:tcPr>
+          <w:p>
+            <w:r>
+              <w:rPr>
+                <w:rFonts w:ascii="Arial" w:cs="Arial" w:eastAsia="Arial" w:hAnsi="Arial"/>
+                <w:sz w:val="20"/>
+                <w:szCs w:val="20"/>
+              </w:rPr>
+              <w:t xml:space="preserve">RLS enabled before any data is written</w:t>
+            </w:r>
+          </w:p>
+        </w:tc>
+      </w:tr>
+      <w:tr>
+        <w:tc>
+          <w:tcPr>
+            <w:tcW w:type="dxa" w:w="3000"/>
+            <w:tcBorders>
+              <w:top w:val="single" w:color="CCCCCC" w:sz="1"/>
+              <w:left w:val="single" w:color="CCCCCC" w:sz="1"/>
+              <w:bottom w:val="single" w:color="CCCCCC" w:sz="1"/>
+              <w:right w:val="single" w:color="CCCCCC" w:sz="1"/>
+            </w:tcBorders>
+            <w:tcMar>
+              <w:top w:type="dxa" w:w="80"/>
+              <w:left w:type="dxa" w:w="120"/>
+              <w:bottom w:type="dxa" w:w="80"/>
+              <w:right w:type="dxa" w:w="120"/>
+            </w:tcMar>
+          </w:tcPr>
+          <w:p>
+            <w:r>
+              <w:rPr>
+                <w:rFonts w:ascii="Arial" w:cs="Arial" w:eastAsia="Arial" w:hAnsi="Arial"/>
+                <w:sz w:val="20"/>
+                <w:szCs w:val="20"/>
+              </w:rPr>
+              <w:t xml:space="preserve">Column naming</w:t>
+            </w:r>
+          </w:p>
+        </w:tc>
+        <w:tc>
+          <w:tcPr>
+            <w:tcW w:type="dxa" w:w="6360"/>
+            <w:tcBorders>
+              <w:top w:val="single" w:color="CCCCCC" w:sz="1"/>
+              <w:left w:val="single" w:color="CCCCCC" w:sz="1"/>
+              <w:bottom w:val="single" w:color="CCCCCC" w:sz="1"/>
+              <w:right w:val="single" w:color="CCCCCC" w:sz="1"/>
+            </w:tcBorders>
+            <w:tcMar>
+              <w:top w:type="dxa" w:w="80"/>
+              <w:left w:type="dxa" w:w="120"/>
+              <w:bottom w:type="dxa" w:w="80"/>
+              <w:right w:type="dxa" w:w="120"/>
+            </w:tcMar>
+          </w:tcPr>
+          <w:p>
+            <w:r>
+              <w:rPr>
+                <w:rFonts w:ascii="Arial" w:cs="Arial" w:eastAsia="Arial" w:hAnsi="Arial"/>
+                <w:sz w:val="20"/>
+                <w:szCs w:val="20"/>
+              </w:rPr>
+              <w:t xml:space="preserve">snake_case. Booleans: is_[name] or has_[name]. Timestamps: created_at, updated_at</w:t>
+            </w:r>
+          </w:p>
+        </w:tc>
+      </w:tr>
+      <w:tr>
+        <w:tc>
+          <w:tcPr>
+            <w:tcW w:type="dxa" w:w="3000"/>
+            <w:tcBorders>
+              <w:top w:val="single" w:color="CCCCCC" w:sz="1"/>
+              <w:left w:val="single" w:color="CCCCCC" w:sz="1"/>
+              <w:bottom w:val="single" w:color="CCCCCC" w:sz="1"/>
+              <w:right w:val="single" w:color="CCCCCC" w:sz="1"/>
+            </w:tcBorders>
+            <w:tcMar>
+              <w:top w:type="dxa" w:w="80"/>
+              <w:left w:type="dxa" w:w="120"/>
+              <w:bottom w:type="dxa" w:w="80"/>
+              <w:right w:type="dxa" w:w="120"/>
+            </w:tcMar>
+          </w:tcPr>
+          <w:p>
+            <w:r>
+              <w:rPr>
+                <w:rFonts w:ascii="Arial" w:cs="Arial" w:eastAsia="Arial" w:hAnsi="Arial"/>
+                <w:sz w:val="20"/>
+                <w:szCs w:val="20"/>
+              </w:rPr>
+              <w:t xml:space="preserve">Schema documentation</w:t>
+            </w:r>
+          </w:p>
+        </w:tc>
+        <w:tc>
+          <w:tcPr>
+            <w:tcW w:type="dxa" w:w="6360"/>
+            <w:tcBorders>
+              <w:top w:val="single" w:color="CCCCCC" w:sz="1"/>
+              <w:left w:val="single" w:color="CCCCCC" w:sz="1"/>
+              <w:bottom w:val="single" w:color="CCCCCC" w:sz="1"/>
+              <w:right w:val="single" w:color="CCCCCC" w:sz="1"/>
+            </w:tcBorders>
+            <w:tcMar>
+              <w:top w:type="dxa" w:w="80"/>
+              <w:left w:type="dxa" w:w="120"/>
+              <w:bottom w:type="dxa" w:w="80"/>
+              <w:right w:type="dxa" w:w="120"/>
+            </w:tcMar>
+          </w:tcPr>
+          <w:p>
+            <w:r>
+              <w:rPr>
+                <w:rFonts w:ascii="Arial" w:cs="Arial" w:eastAsia="Arial" w:hAnsi="Arial"/>
+                <w:sz w:val="20"/>
+                <w:szCs w:val="20"/>
+              </w:rPr>
+              <w:t xml:space="preserve">Any new tables must be documented in this spec before creation</w:t>
+            </w:r>
+          </w:p>
+        </w:tc>
+      </w:tr>
+    </w:tbl>
+    <w:p/>
+    <w:p>
+      <w:pPr>
+        <w:pStyle w:val="Heading1"/>
+        <w:spacing w:after="200" w:before="400"/>
+      </w:pPr>
+      <w:r>
+        <w:rPr>
+          <w:rFonts w:ascii="Arial" w:cs="Arial" w:eastAsia="Arial" w:hAnsi="Arial"/>
+          <w:b/>
+          <w:bCs/>
+          <w:sz w:val="32"/>
+          <w:szCs w:val="32"/>
+        </w:rPr>
+        <w:t xml:space="preserve">3. Terminology</w:t>
       </w:r>
     </w:p>
     <w:tbl>
@@ -1560,7 +3175,7 @@
           <w:sz w:val="32"/>
           <w:szCs w:val="32"/>
         </w:rPr>
-        <w:t xml:space="preserve">3. Page Structure</w:t>
+        <w:t xml:space="preserve">4. Page Structure</w:t>
       </w:r>
     </w:p>
     <w:p>
@@ -1576,7 +3191,7 @@
           <w:sz w:val="26"/>
           <w:szCs w:val="26"/>
         </w:rPr>
-        <w:t xml:space="preserve">3.1 Navigation</w:t>
+        <w:t xml:space="preserve">4.1 Navigation</w:t>
       </w:r>
     </w:p>
     <w:p>
@@ -1631,7 +3246,7 @@
           <w:sz w:val="26"/>
           <w:szCs w:val="26"/>
         </w:rPr>
-        <w:t xml:space="preserve">3.2 Create Tab</w:t>
+        <w:t xml:space="preserve">4.2 Create Tab</w:t>
       </w:r>
     </w:p>
     <w:p>
@@ -1660,7 +3275,7 @@
           <w:sz w:val="26"/>
           <w:szCs w:val="26"/>
         </w:rPr>
-        <w:t xml:space="preserve">3.3 Campaign Tab</w:t>
+        <w:t xml:space="preserve">4.3 Campaign Tab</w:t>
       </w:r>
     </w:p>
     <w:p>
@@ -1689,7 +3304,7 @@
           <w:sz w:val="26"/>
           <w:szCs w:val="26"/>
         </w:rPr>
-        <w:t xml:space="preserve">3.4 Management Tabs</w:t>
+        <w:t xml:space="preserve">4.4 Management Tabs</w:t>
       </w:r>
     </w:p>
     <w:p>
@@ -1744,7 +3359,7 @@
           <w:sz w:val="26"/>
           <w:szCs w:val="26"/>
         </w:rPr>
-        <w:t xml:space="preserve">3.5 Connections (Settings)</w:t>
+        <w:t xml:space="preserve">4.5 Connections (Settings)</w:t>
       </w:r>
     </w:p>
     <w:p>
@@ -1799,7 +3414,7 @@
           <w:sz w:val="32"/>
           <w:szCs w:val="32"/>
         </w:rPr>
-        <w:t xml:space="preserve">4. Journey Groups</w:t>
+        <w:t xml:space="preserve">5. Journey Groups</w:t>
       </w:r>
     </w:p>
     <w:tbl>
@@ -2131,7 +3746,7 @@
           <w:sz w:val="32"/>
           <w:szCs w:val="32"/>
         </w:rPr>
-        <w:t xml:space="preserve">4A. Common Journey Features</w:t>
+        <w:t xml:space="preserve">5A. Common Journey Features</w:t>
       </w:r>
     </w:p>
     <w:p>
@@ -2147,7 +3762,7 @@
           <w:sz w:val="26"/>
           <w:szCs w:val="26"/>
         </w:rPr>
-        <w:t xml:space="preserve">4A.1 Media Handling</w:t>
+        <w:t xml:space="preserve">5A.1 Media Handling</w:t>
       </w:r>
     </w:p>
     <w:p>
@@ -2241,7 +3856,7 @@
           <w:sz w:val="26"/>
           <w:szCs w:val="26"/>
         </w:rPr>
-        <w:t xml:space="preserve">4A.2 Hashtags</w:t>
+        <w:t xml:space="preserve">5A.2 Hashtags</w:t>
       </w:r>
     </w:p>
     <w:p>
@@ -2296,7 +3911,7 @@
           <w:sz w:val="26"/>
           <w:szCs w:val="26"/>
         </w:rPr>
-        <w:t xml:space="preserve">4A.3 Save &amp; Exit</w:t>
+        <w:t xml:space="preserve">5A.3 Save &amp; Exit</w:t>
       </w:r>
     </w:p>
     <w:p>
@@ -2364,7 +3979,7 @@
           <w:sz w:val="26"/>
           <w:szCs w:val="26"/>
         </w:rPr>
-        <w:t xml:space="preserve">4A.4 Journey Record Reuse</w:t>
+        <w:t xml:space="preserve">5A.4 Journey Record Reuse</w:t>
       </w:r>
     </w:p>
     <w:p>
@@ -2475,7 +4090,7 @@
           <w:sz w:val="32"/>
           <w:szCs w:val="32"/>
         </w:rPr>
-        <w:t xml:space="preserve">5. Journey Specifications</w:t>
+        <w:t xml:space="preserve">6. Journey Specifications</w:t>
       </w:r>
     </w:p>
     <w:p>
@@ -2491,7 +4106,7 @@
           <w:sz w:val="26"/>
           <w:szCs w:val="26"/>
         </w:rPr>
-        <w:t xml:space="preserve">5.1 Finished Job Post</w:t>
+        <w:t xml:space="preserve">6.1 Finished Job Post</w:t>
       </w:r>
     </w:p>
     <w:p>
@@ -4045,7 +5660,7 @@
           <w:sz w:val="26"/>
           <w:szCs w:val="26"/>
         </w:rPr>
-        <w:t xml:space="preserve">5.2 Customer Story/Testimonial</w:t>
+        <w:t xml:space="preserve">6.2 Customer Story/Testimonial</w:t>
       </w:r>
     </w:p>
     <w:p>
@@ -5987,7 +7602,7 @@
           <w:sz w:val="26"/>
           <w:szCs w:val="26"/>
         </w:rPr>
-        <w:t xml:space="preserve">5.3 Behind the Scenes</w:t>
+        <w:t xml:space="preserve">6.3 Behind the Scenes</w:t>
       </w:r>
     </w:p>
     <w:p>
@@ -6805,7 +8420,7 @@
           <w:sz w:val="26"/>
           <w:szCs w:val="26"/>
         </w:rPr>
-        <w:t xml:space="preserve">5.4 New Product/Service Launch</w:t>
+        <w:t xml:space="preserve">6.4 New Product/Service Launch</w:t>
       </w:r>
     </w:p>
     <w:p>
@@ -8218,7 +9833,7 @@
           <w:sz w:val="26"/>
           <w:szCs w:val="26"/>
         </w:rPr>
-        <w:t xml:space="preserve">5.5 Event Promotion</w:t>
+        <w:t xml:space="preserve">6.5 Event Promotion</w:t>
       </w:r>
     </w:p>
     <w:p>
@@ -9605,7 +11220,7 @@
           <w:sz w:val="26"/>
           <w:szCs w:val="26"/>
         </w:rPr>
-        <w:t xml:space="preserve">5.6 Offer/Promotion</w:t>
+        <w:t xml:space="preserve">6.6 Offer/Promotion</w:t>
       </w:r>
     </w:p>
     <w:p>
@@ -10659,7 +12274,7 @@
           <w:sz w:val="26"/>
           <w:szCs w:val="26"/>
         </w:rPr>
-        <w:t xml:space="preserve">5.7 Industry Insight/News</w:t>
+        <w:t xml:space="preserve">6.7 Industry Insight/News</w:t>
       </w:r>
     </w:p>
     <w:p>
@@ -11630,7 +13245,7 @@
           <w:sz w:val="26"/>
           <w:szCs w:val="26"/>
         </w:rPr>
-        <w:t xml:space="preserve">5.8 Tips &amp; Advice</w:t>
+        <w:t xml:space="preserve">6.8 Tips &amp; Advice</w:t>
       </w:r>
     </w:p>
     <w:p>
@@ -12601,7 +14216,7 @@
           <w:sz w:val="26"/>
           <w:szCs w:val="26"/>
         </w:rPr>
-        <w:t xml:space="preserve">5.9 Blog Content</w:t>
+        <w:t xml:space="preserve">6.9 Blog Content</w:t>
       </w:r>
     </w:p>
     <w:p>
@@ -13515,7 +15130,7 @@
           <w:sz w:val="26"/>
           <w:szCs w:val="26"/>
         </w:rPr>
-        <w:t xml:space="preserve">5.10 Business Update/Announcement</w:t>
+        <w:t xml:space="preserve">6.10 Business Update/Announcement</w:t>
       </w:r>
     </w:p>
     <w:p>
@@ -14499,7 +16114,7 @@
           <w:sz w:val="32"/>
           <w:szCs w:val="32"/>
         </w:rPr>
-        <w:t xml:space="preserve">6. Marketing Campaign</w:t>
+        <w:t xml:space="preserve">7. Marketing Campaign</w:t>
       </w:r>
     </w:p>
     <w:p>
@@ -14528,7 +16143,7 @@
           <w:sz w:val="26"/>
           <w:szCs w:val="26"/>
         </w:rPr>
-        <w:t xml:space="preserve">6.1 Campaign Structure</w:t>
+        <w:t xml:space="preserve">7.1 Campaign Structure</w:t>
       </w:r>
     </w:p>
     <w:p>
@@ -14590,7 +16205,7 @@
           <w:sz w:val="26"/>
           <w:szCs w:val="26"/>
         </w:rPr>
-        <w:t xml:space="preserve">6.2 Campaign States</w:t>
+        <w:t xml:space="preserve">7.2 Campaign States</w:t>
       </w:r>
     </w:p>
     <w:tbl>
@@ -15077,7 +16692,7 @@
           <w:sz w:val="26"/>
           <w:szCs w:val="26"/>
         </w:rPr>
-        <w:t xml:space="preserve">6.3 Phase 1: Create Marketing Plan</w:t>
+        <w:t xml:space="preserve">7.3 Phase 1: Create Marketing Plan</w:t>
       </w:r>
     </w:p>
     <w:p>
@@ -15093,7 +16708,7 @@
           <w:sz w:val="22"/>
           <w:szCs w:val="22"/>
         </w:rPr>
-        <w:t xml:space="preserve">6.3.1 Wizard Overview</w:t>
+        <w:t xml:space="preserve">7.3.1 Wizard Overview</w:t>
       </w:r>
     </w:p>
     <w:p>
@@ -15122,7 +16737,7 @@
           <w:sz w:val="22"/>
           <w:szCs w:val="22"/>
         </w:rPr>
-        <w:t xml:space="preserve">6.3.2 Data from Business Profile</w:t>
+        <w:t xml:space="preserve">7.3.2 Data from Business Profile</w:t>
       </w:r>
     </w:p>
     <w:p>
@@ -15235,7 +16850,7 @@
           <w:sz w:val="22"/>
           <w:szCs w:val="22"/>
         </w:rPr>
-        <w:t xml:space="preserve">6.3.3 Campaign-Specific Questions</w:t>
+        <w:t xml:space="preserve">7.3.3 Campaign-Specific Questions</w:t>
       </w:r>
     </w:p>
     <w:p>
@@ -15412,7 +17027,7 @@
           <w:sz w:val="22"/>
           <w:szCs w:val="22"/>
         </w:rPr>
-        <w:t xml:space="preserve">6.3.4 AI Generates Marketing Plan</w:t>
+        <w:t xml:space="preserve">7.3.4 AI Generates Marketing Plan</w:t>
       </w:r>
     </w:p>
     <w:p>
@@ -15524,7 +17139,7 @@
           <w:sz w:val="26"/>
           <w:szCs w:val="26"/>
         </w:rPr>
-        <w:t xml:space="preserve">6.4 Phase 2: Implement Marketing Plan</w:t>
+        <w:t xml:space="preserve">7.4 Phase 2: Implement Marketing Plan</w:t>
       </w:r>
     </w:p>
     <w:p>
@@ -15540,7 +17155,7 @@
           <w:sz w:val="22"/>
           <w:szCs w:val="22"/>
         </w:rPr>
-        <w:t xml:space="preserve">6.4.1 Content Generation</w:t>
+        <w:t xml:space="preserve">7.4.1 Content Generation</w:t>
       </w:r>
     </w:p>
     <w:p>
@@ -15569,7 +17184,7 @@
           <w:sz w:val="22"/>
           <w:szCs w:val="22"/>
         </w:rPr>
-        <w:t xml:space="preserve">6.4.2 Review Posts</w:t>
+        <w:t xml:space="preserve">7.4.2 Review Posts</w:t>
       </w:r>
     </w:p>
     <w:p>
@@ -15637,7 +17252,7 @@
           <w:sz w:val="22"/>
           <w:szCs w:val="22"/>
         </w:rPr>
-        <w:t xml:space="preserve">6.4.3 Edit Mode</w:t>
+        <w:t xml:space="preserve">7.4.3 Edit Mode</w:t>
       </w:r>
     </w:p>
     <w:p>
@@ -15666,7 +17281,7 @@
           <w:sz w:val="22"/>
           <w:szCs w:val="22"/>
         </w:rPr>
-        <w:t xml:space="preserve">6.4.4 Launch Campaign</w:t>
+        <w:t xml:space="preserve">7.4.4 Launch Campaign</w:t>
       </w:r>
     </w:p>
     <w:p>
@@ -15695,7 +17310,7 @@
           <w:sz w:val="26"/>
           <w:szCs w:val="26"/>
         </w:rPr>
-        <w:t xml:space="preserve">6.5 Active Campaign Management</w:t>
+        <w:t xml:space="preserve">7.5 Active Campaign Management</w:t>
       </w:r>
     </w:p>
     <w:p>
@@ -15711,7 +17326,7 @@
           <w:sz w:val="22"/>
           <w:szCs w:val="22"/>
         </w:rPr>
-        <w:t xml:space="preserve">6.5.1 Campaign Tab Display</w:t>
+        <w:t xml:space="preserve">7.5.1 Campaign Tab Display</w:t>
       </w:r>
     </w:p>
     <w:p>
@@ -15779,7 +17394,7 @@
           <w:sz w:val="22"/>
           <w:szCs w:val="22"/>
         </w:rPr>
-        <w:t xml:space="preserve">6.5.2 Quick Actions</w:t>
+        <w:t xml:space="preserve">7.5.2 Quick Actions</w:t>
       </w:r>
     </w:p>
     <w:p>
@@ -15910,7 +17525,7 @@
           <w:sz w:val="26"/>
           <w:szCs w:val="26"/>
         </w:rPr>
-        <w:t xml:space="preserve">6.6 Campaign Analytics</w:t>
+        <w:t xml:space="preserve">7.6 Campaign Analytics</w:t>
       </w:r>
     </w:p>
     <w:p>
@@ -15965,7 +17580,7 @@
           <w:sz w:val="26"/>
           <w:szCs w:val="26"/>
         </w:rPr>
-        <w:t xml:space="preserve">6.7 Campaign History</w:t>
+        <w:t xml:space="preserve">7.7 Campaign History</w:t>
       </w:r>
     </w:p>
     <w:p>
@@ -15994,7 +17609,7 @@
           <w:sz w:val="26"/>
           <w:szCs w:val="26"/>
         </w:rPr>
-        <w:t xml:space="preserve">6.8 Strategic Plan Integration</w:t>
+        <w:t xml:space="preserve">7.8 Strategic Plan Integration</w:t>
       </w:r>
     </w:p>
     <w:p>
@@ -16036,7 +17651,7 @@
           <w:sz w:val="32"/>
           <w:szCs w:val="32"/>
         </w:rPr>
-        <w:t xml:space="preserve">7. Management Tabs</w:t>
+        <w:t xml:space="preserve">8. Management Tabs</w:t>
       </w:r>
     </w:p>
     <w:p>
@@ -16065,7 +17680,7 @@
           <w:sz w:val="26"/>
           <w:szCs w:val="26"/>
         </w:rPr>
-        <w:t xml:space="preserve">7.1 Common Features</w:t>
+        <w:t xml:space="preserve">8.1 Common Features</w:t>
       </w:r>
     </w:p>
     <w:p>
@@ -16120,7 +17735,7 @@
           <w:sz w:val="26"/>
           <w:szCs w:val="26"/>
         </w:rPr>
-        <w:t xml:space="preserve">7.2 Drafts Tab</w:t>
+        <w:t xml:space="preserve">8.2 Drafts Tab</w:t>
       </w:r>
     </w:p>
     <w:p>
@@ -16254,7 +17869,7 @@
           <w:sz w:val="26"/>
           <w:szCs w:val="26"/>
         </w:rPr>
-        <w:t xml:space="preserve">7.3 Scheduled Tab</w:t>
+        <w:t xml:space="preserve">8.3 Scheduled Tab</w:t>
       </w:r>
     </w:p>
     <w:p>
@@ -16411,7 +18026,7 @@
           <w:sz w:val="26"/>
           <w:szCs w:val="26"/>
         </w:rPr>
-        <w:t xml:space="preserve">7.4 Published Tab</w:t>
+        <w:t xml:space="preserve">8.4 Published Tab</w:t>
       </w:r>
     </w:p>
     <w:p>
@@ -16568,7 +18183,7 @@
           <w:sz w:val="26"/>
           <w:szCs w:val="26"/>
         </w:rPr>
-        <w:t xml:space="preserve">7.5 Metrics Data Source</w:t>
+        <w:t xml:space="preserve">8.5 Metrics Data Source</w:t>
       </w:r>
     </w:p>
     <w:p>
@@ -16623,7 +18238,7 @@
           <w:sz w:val="26"/>
           <w:szCs w:val="26"/>
         </w:rPr>
-        <w:t xml:space="preserve">7.6 Campaign Posts</w:t>
+        <w:t xml:space="preserve">8.6 Campaign Posts</w:t>
       </w:r>
     </w:p>
     <w:p>
@@ -16652,7 +18267,7 @@
           <w:sz w:val="32"/>
           <w:szCs w:val="32"/>
         </w:rPr>
-        <w:t xml:space="preserve">8. Content Library Projects Tab</w:t>
+        <w:t xml:space="preserve">9. Content Library Projects Tab</w:t>
       </w:r>
     </w:p>
     <w:p>
@@ -16681,7 +18296,7 @@
           <w:sz w:val="26"/>
           <w:szCs w:val="26"/>
         </w:rPr>
-        <w:t xml:space="preserve">8.1 Purpose</w:t>
+        <w:t xml:space="preserve">9.1 Purpose</w:t>
       </w:r>
     </w:p>
     <w:p>
@@ -16779,7 +18394,7 @@
           <w:sz w:val="26"/>
           <w:szCs w:val="26"/>
         </w:rPr>
-        <w:t xml:space="preserve">8.2 Data Sources</w:t>
+        <w:t xml:space="preserve">9.2 Data Sources</w:t>
       </w:r>
     </w:p>
     <w:tbl>
@@ -17237,7 +18852,7 @@
           <w:sz w:val="26"/>
           <w:szCs w:val="26"/>
         </w:rPr>
-        <w:t xml:space="preserve">8.3 Sync Behaviour</w:t>
+        <w:t xml:space="preserve">9.3 Sync Behaviour</w:t>
       </w:r>
     </w:p>
     <w:p>
@@ -17321,7 +18936,7 @@
           <w:sz w:val="26"/>
           <w:szCs w:val="26"/>
         </w:rPr>
-        <w:t xml:space="preserve">8.4 Project Record Schema</w:t>
+        <w:t xml:space="preserve">9.4 Project Record Schema</w:t>
       </w:r>
     </w:p>
     <w:tbl>
@@ -19898,7 +21513,7 @@
           <w:sz w:val="26"/>
           <w:szCs w:val="26"/>
         </w:rPr>
-        <w:t xml:space="preserve">8.5 Logo Fetch</w:t>
+        <w:t xml:space="preserve">9.5 Logo Fetch</w:t>
       </w:r>
     </w:p>
     <w:p>
@@ -19966,7 +21581,7 @@
           <w:sz w:val="32"/>
           <w:szCs w:val="32"/>
         </w:rPr>
-        <w:t xml:space="preserve">9. Business Profile Updates</w:t>
+        <w:t xml:space="preserve">10. Business Profile Updates</w:t>
       </w:r>
     </w:p>
     <w:p>
@@ -19995,7 +21610,7 @@
           <w:sz w:val="26"/>
           <w:szCs w:val="26"/>
         </w:rPr>
-        <w:t xml:space="preserve">9.1 Marketing Theme Redesign</w:t>
+        <w:t xml:space="preserve">10.1 Marketing Theme Redesign</w:t>
       </w:r>
     </w:p>
     <w:p>
@@ -20024,7 +21639,7 @@
           <w:sz w:val="22"/>
           <w:szCs w:val="22"/>
         </w:rPr>
-        <w:t xml:space="preserve">9.1.1 Design Principles</w:t>
+        <w:t xml:space="preserve">10.1.1 Design Principles</w:t>
       </w:r>
     </w:p>
     <w:p>
@@ -20110,7 +21725,7 @@
           <w:sz w:val="22"/>
           <w:szCs w:val="22"/>
         </w:rPr>
-        <w:t xml:space="preserve">9.1.2 Guided Conversation Flow — Overview</w:t>
+        <w:t xml:space="preserve">10.1.2 Guided Conversation Flow — Overview</w:t>
       </w:r>
     </w:p>
     <w:p>
@@ -20264,7 +21879,7 @@
           <w:sz w:val="22"/>
           <w:szCs w:val="22"/>
         </w:rPr>
-        <w:t xml:space="preserve">9.1.3 Guided Conversation Flow — Full Detail</w:t>
+        <w:t xml:space="preserve">10.1.3 Guided Conversation Flow — Full Detail</w:t>
       </w:r>
     </w:p>
     <w:p>
@@ -21754,7 +23369,7 @@
           <w:sz w:val="22"/>
           <w:szCs w:val="22"/>
         </w:rPr>
-        <w:t xml:space="preserve">9.1.4 Summary Screen</w:t>
+        <w:t xml:space="preserve">10.1.4 Summary Screen</w:t>
       </w:r>
     </w:p>
     <w:p>
@@ -21963,7 +23578,7 @@
           <w:sz w:val="22"/>
           <w:szCs w:val="22"/>
         </w:rPr>
-        <w:t xml:space="preserve">9.1.5 What Gets Saved</w:t>
+        <w:t xml:space="preserve">10.1.5 What Gets Saved</w:t>
       </w:r>
     </w:p>
     <w:p>
@@ -22519,7 +24134,7 @@
           <w:sz w:val="26"/>
           <w:szCs w:val="26"/>
         </w:rPr>
-        <w:t xml:space="preserve">9.2 Existing Fields (Populated by Guided Conversation)</w:t>
+        <w:t xml:space="preserve">10.2 Existing Fields (Populated by Guided Conversation)</w:t>
       </w:r>
     </w:p>
     <w:tbl>
@@ -22838,7 +24453,7 @@
           <w:sz w:val="26"/>
           <w:szCs w:val="26"/>
         </w:rPr>
-        <w:t xml:space="preserve">9.3 New Fields</w:t>
+        <w:t xml:space="preserve">10.3 New Fields</w:t>
       </w:r>
     </w:p>
     <w:tbl>
@@ -23435,7 +25050,7 @@
           <w:sz w:val="26"/>
           <w:szCs w:val="26"/>
         </w:rPr>
-        <w:t xml:space="preserve">9.4 Tone of Voice Options</w:t>
+        <w:t xml:space="preserve">10.4 Tone of Voice Options</w:t>
       </w:r>
     </w:p>
     <w:tbl>
@@ -23823,7 +25438,7 @@
           <w:sz w:val="32"/>
           <w:szCs w:val="32"/>
         </w:rPr>
-        <w:t xml:space="preserve">10. Predis.ai Integration</w:t>
+        <w:t xml:space="preserve">11. Predis.ai Integration</w:t>
       </w:r>
     </w:p>
     <w:p>
@@ -23852,7 +25467,7 @@
           <w:sz w:val="26"/>
           <w:szCs w:val="26"/>
         </w:rPr>
-        <w:t xml:space="preserve">10.1 Integration Flow</w:t>
+        <w:t xml:space="preserve">11.1 Integration Flow</w:t>
       </w:r>
     </w:p>
     <w:p>
@@ -23878,7 +25493,7 @@
           <w:sz w:val="20"/>
           <w:szCs w:val="20"/>
         </w:rPr>
-        <w:t xml:space="preserve">2. Our backend (Claude) builds prompt from Inputs</w:t>
+        <w:t xml:space="preserve">3. Our backend (Claude) builds prompt from Inputs</w:t>
       </w:r>
     </w:p>
     <w:p>
@@ -23891,7 +25506,7 @@
           <w:sz w:val="20"/>
           <w:szCs w:val="20"/>
         </w:rPr>
-        <w:t xml:space="preserve">3. We call Predis API with: brand_id, prompt, media_type, template_id</w:t>
+        <w:t xml:space="preserve">4. We call Predis API with: brand_id, prompt, media_type, template_id</w:t>
       </w:r>
     </w:p>
     <w:p>
@@ -23904,7 +25519,7 @@
           <w:sz w:val="20"/>
           <w:szCs w:val="20"/>
         </w:rPr>
-        <w:t xml:space="preserve">4. Predis generates the Output (async)</w:t>
+        <w:t xml:space="preserve">5. Predis generates the Output (async)</w:t>
       </w:r>
     </w:p>
     <w:p>
@@ -23917,7 +25532,7 @@
           <w:sz w:val="20"/>
           <w:szCs w:val="20"/>
         </w:rPr>
-        <w:t xml:space="preserve">5. Webhook returns completed image/video + caption</w:t>
+        <w:t xml:space="preserve">6. Webhook returns completed image/video + caption</w:t>
       </w:r>
     </w:p>
     <w:p>
@@ -23930,7 +25545,7 @@
           <w:sz w:val="20"/>
           <w:szCs w:val="20"/>
         </w:rPr>
-        <w:t xml:space="preserve">6. We display in StaxAI preview for user approval</w:t>
+        <w:t xml:space="preserve">7. We display in StaxAI preview for user approval</w:t>
       </w:r>
     </w:p>
     <w:p>
@@ -23943,7 +25558,7 @@
           <w:sz w:val="20"/>
           <w:szCs w:val="20"/>
         </w:rPr>
-        <w:t xml:space="preserve">7. User approves — we schedule/publish via our Connections (Meta API)</w:t>
+        <w:t xml:space="preserve">8. User approves — we schedule/publish via our Connections (Meta API)</w:t>
       </w:r>
     </w:p>
     <w:p>
@@ -23956,7 +25571,7 @@
           <w:sz w:val="20"/>
           <w:szCs w:val="20"/>
         </w:rPr>
-        <w:t xml:space="preserve">8. Journey Record saved to our database</w:t>
+        <w:t xml:space="preserve">9. Journey Record saved to our database</w:t>
       </w:r>
     </w:p>
     <w:p>
@@ -23972,7 +25587,7 @@
           <w:sz w:val="26"/>
           <w:szCs w:val="26"/>
         </w:rPr>
-        <w:t xml:space="preserve">10.2 What We Control vs What Predis Does</w:t>
+        <w:t xml:space="preserve">11.2 What We Control vs What Predis Does</w:t>
       </w:r>
     </w:p>
     <w:tbl>
@@ -24515,7 +26130,7 @@
           <w:sz w:val="26"/>
           <w:szCs w:val="26"/>
         </w:rPr>
-        <w:t xml:space="preserve">10.3 Predis Brand Sync</w:t>
+        <w:t xml:space="preserve">11.3 Predis Brand Sync</w:t>
       </w:r>
     </w:p>
     <w:p>
@@ -24554,7 +26169,7 @@
           <w:sz w:val="20"/>
           <w:szCs w:val="20"/>
         </w:rPr>
-        <w:t xml:space="preserve">2. Pass: business name, logo URL, colours, tone, website</w:t>
+        <w:t xml:space="preserve">3. Pass: business name, logo URL, colours, tone, website</w:t>
       </w:r>
     </w:p>
     <w:p>
@@ -24567,7 +26182,7 @@
           <w:sz w:val="20"/>
           <w:szCs w:val="20"/>
         </w:rPr>
-        <w:t xml:space="preserve">3. All future Predis generations use these settings automatically</w:t>
+        <w:t xml:space="preserve">4. All future Predis generations use these settings automatically</w:t>
       </w:r>
     </w:p>
     <w:p>
@@ -24583,7 +26198,7 @@
           <w:sz w:val="26"/>
           <w:szCs w:val="26"/>
         </w:rPr>
-        <w:t xml:space="preserve">10.4 Pricing Model</w:t>
+        <w:t xml:space="preserve">11.4 Pricing Model</w:t>
       </w:r>
     </w:p>
     <w:p>
@@ -24681,7 +26296,7 @@
           <w:sz w:val="26"/>
           <w:szCs w:val="26"/>
         </w:rPr>
-        <w:t xml:space="preserve">10.5 Technical Setup Required</w:t>
+        <w:t xml:space="preserve">11.5 Technical Setup Required</w:t>
       </w:r>
     </w:p>
     <w:p>
@@ -24707,7 +26322,7 @@
           <w:sz w:val="20"/>
           <w:szCs w:val="20"/>
         </w:rPr>
-        <w:t xml:space="preserve">2. API integration — webhook endpoint to receive completed outputs</w:t>
+        <w:t xml:space="preserve">3. API integration — webhook endpoint to receive completed outputs</w:t>
       </w:r>
     </w:p>
     <w:p>
@@ -24720,7 +26335,7 @@
           <w:sz w:val="20"/>
           <w:szCs w:val="20"/>
         </w:rPr>
-        <w:t xml:space="preserve">3. Brand management — create/update Predis Brand when user updates BP</w:t>
+        <w:t xml:space="preserve">4. Brand management — create/update Predis Brand when user updates BP</w:t>
       </w:r>
     </w:p>
     <w:p>
@@ -24733,7 +26348,7 @@
           <w:sz w:val="20"/>
           <w:szCs w:val="20"/>
         </w:rPr>
-        <w:t xml:space="preserve">4. Template curation — decide which Predis templates to expose to users</w:t>
+        <w:t xml:space="preserve">5. Template curation — decide which Predis templates to expose to users</w:t>
       </w:r>
     </w:p>
     <w:p>
@@ -24746,7 +26361,7 @@
           <w:sz w:val="20"/>
           <w:szCs w:val="20"/>
         </w:rPr>
-        <w:t xml:space="preserve">5. Credit tracking — monitor usage across users</w:t>
+        <w:t xml:space="preserve">6. Credit tracking — monitor usage across users</w:t>
       </w:r>
     </w:p>
     <w:p>
@@ -24762,7 +26377,7 @@
           <w:sz w:val="32"/>
           <w:szCs w:val="32"/>
         </w:rPr>
-        <w:t xml:space="preserve">11. Technical Specification</w:t>
+        <w:t xml:space="preserve">12. Technical Specification</w:t>
       </w:r>
     </w:p>
     <w:p>
@@ -24778,7 +26393,7 @@
           <w:sz w:val="26"/>
           <w:szCs w:val="26"/>
         </w:rPr>
-        <w:t xml:space="preserve">11.1 Files</w:t>
+        <w:t xml:space="preserve">12.1 Files</w:t>
       </w:r>
     </w:p>
     <w:tbl>
@@ -25900,7 +27515,7 @@
           <w:sz w:val="26"/>
           <w:szCs w:val="26"/>
         </w:rPr>
-        <w:t xml:space="preserve">11.2 Database Tables</w:t>
+        <w:t xml:space="preserve">12.2 Database Tables</w:t>
       </w:r>
     </w:p>
     <w:tbl>
@@ -26387,7 +28002,7 @@
           <w:sz w:val="26"/>
           <w:szCs w:val="26"/>
         </w:rPr>
-        <w:t xml:space="preserve">11.3 APIs</w:t>
+        <w:t xml:space="preserve">12.3 APIs</w:t>
       </w:r>
     </w:p>
     <w:tbl>
@@ -26650,7 +28265,7 @@
           <w:sz w:val="26"/>
           <w:szCs w:val="26"/>
         </w:rPr>
-        <w:t xml:space="preserve">11.4 Platform Standards</w:t>
+        <w:t xml:space="preserve">12.4 Platform Standards</w:t>
       </w:r>
     </w:p>
     <w:p>
@@ -26777,7 +28392,7 @@
           <w:sz w:val="32"/>
           <w:szCs w:val="32"/>
         </w:rPr>
-        <w:t xml:space="preserve">12. Journey Record Schema</w:t>
+        <w:t xml:space="preserve">13. Journey Record Schema</w:t>
       </w:r>
     </w:p>
     <w:p>
@@ -27995,7 +29610,7 @@
           <w:sz w:val="32"/>
           <w:szCs w:val="32"/>
         </w:rPr>
-        <w:t xml:space="preserve">13. Known Build Gaps (from Code Audit)</w:t>
+        <w:t xml:space="preserve">14. Known Build Gaps (from Code Audit)</w:t>
       </w:r>
     </w:p>
     <w:p>
@@ -28987,7 +30602,7 @@
           <w:sz w:val="32"/>
           <w:szCs w:val="32"/>
         </w:rPr>
-        <w:t xml:space="preserve">14. Integration Points</w:t>
+        <w:t xml:space="preserve">15. Integration Points</w:t>
       </w:r>
     </w:p>
     <w:tbl>
@@ -29586,7 +31201,7 @@
           <w:sz w:val="32"/>
           <w:szCs w:val="32"/>
         </w:rPr>
-        <w:t xml:space="preserve">15. Future Features (Post-Launch)</w:t>
+        <w:t xml:space="preserve">16. Future Features (Post-Launch)</w:t>
       </w:r>
     </w:p>
     <w:tbl>
@@ -29961,7 +31576,7 @@
           <w:sz w:val="32"/>
           <w:szCs w:val="32"/>
         </w:rPr>
-        <w:t xml:space="preserve">16. Version History</w:t>
+        <w:t xml:space="preserve">17. Version History</w:t>
       </w:r>
     </w:p>
     <w:tbl>
@@ -30234,7 +31849,7 @@
                 <w:sz w:val="20"/>
                 <w:szCs w:val="20"/>
               </w:rPr>
-              <w:t xml:space="preserve">Section 6 (Marketing Campaign) fully specified: Phase 1 Create Marketing Plan wizard, Phase 2 Implement Marketing Plan, active Campaign management, analytics, history. Section 7 (Management Tabs) fully specified: Drafts, Scheduled, Published tabs with pagination, search, bulk actions, metrics. Section 9 (Business Profile Updates) expanded: BP Marketing Theme redesign with guided conversation flow, four new fields (colours, tone, tagline). Ideogram references removed — Predis is the sole graphics API. DRAFT status removed — document approved.</w:t>
+              <w:t xml:space="preserve">Section 7 (Marketing Campaign) fully specified: Phase 1 Create Marketing Plan wizard, Phase 2 Implement Marketing Plan, active Campaign management, analytics, history. Section 8 (Management Tabs) fully specified: Drafts, Scheduled, Published tabs with pagination, search, bulk actions, metrics. Section 10 (Business Profile Updates) expanded: BP Marketing Theme redesign with guided conversation flow, four new fields (colours, tone, tagline). Ideogram references removed — Predis is the sole graphics API. DRAFT status removed — document approved.</w:t>
             </w:r>
           </w:p>
         </w:tc>
@@ -30317,7 +31932,90 @@
                 <w:sz w:val="20"/>
                 <w:szCs w:val="20"/>
               </w:rPr>
-              <w:t xml:space="preserve">Merged v1.0 and v1.1 into single complete document. Section 5 Journey Specifications restored in full. Section 8 CL Projects Tab restored in full. Section 9.1.3 Guided Conversation Flow expanded with full question detail, all multi-select options, follow-up logic, summary screen, and field mapping. Section 10 Predis Integration restored in full. Section 12 Journey Record Schema restored in full. Section 14 Integration Points restored in full. All "see v1.0" references removed — document is now fully self-contained.</w:t>
+              <w:t xml:space="preserve">Merged v1.0 and v1.1 into single complete document. Section 6 Journey Specifications restored in full. Section 9 CL Projects Tab restored in full. Section 10.1.3 Guided Conversation Flow expanded with full question detail, all multi-select options, follow-up logic, summary screen, and field mapping. Section 11 Predis Integration restored in full. Section 13 Journey Record Schema restored in full. Section 15 Integration Points restored in full. All "see v1.0" references removed — document is now fully self-contained.</w:t>
+            </w:r>
+          </w:p>
+        </w:tc>
+      </w:tr>
+      <w:tr>
+        <w:tc>
+          <w:tcPr>
+            <w:tcW w:type="dxa" w:w="1000"/>
+            <w:tcBorders>
+              <w:top w:val="single" w:color="CCCCCC" w:sz="1"/>
+              <w:left w:val="single" w:color="CCCCCC" w:sz="1"/>
+              <w:bottom w:val="single" w:color="CCCCCC" w:sz="1"/>
+              <w:right w:val="single" w:color="CCCCCC" w:sz="1"/>
+            </w:tcBorders>
+            <w:tcMar>
+              <w:top w:type="dxa" w:w="80"/>
+              <w:left w:type="dxa" w:w="120"/>
+              <w:bottom w:type="dxa" w:w="80"/>
+              <w:right w:type="dxa" w:w="120"/>
+            </w:tcMar>
+          </w:tcPr>
+          <w:p>
+            <w:r>
+              <w:rPr>
+                <w:rFonts w:ascii="Arial" w:cs="Arial" w:eastAsia="Arial" w:hAnsi="Arial"/>
+                <w:sz w:val="20"/>
+                <w:szCs w:val="20"/>
+              </w:rPr>
+              <w:t xml:space="preserve">1.3</w:t>
+            </w:r>
+          </w:p>
+        </w:tc>
+        <w:tc>
+          <w:tcPr>
+            <w:tcW w:type="dxa" w:w="1500"/>
+            <w:tcBorders>
+              <w:top w:val="single" w:color="CCCCCC" w:sz="1"/>
+              <w:left w:val="single" w:color="CCCCCC" w:sz="1"/>
+              <w:bottom w:val="single" w:color="CCCCCC" w:sz="1"/>
+              <w:right w:val="single" w:color="CCCCCC" w:sz="1"/>
+            </w:tcBorders>
+            <w:tcMar>
+              <w:top w:type="dxa" w:w="80"/>
+              <w:left w:type="dxa" w:w="120"/>
+              <w:bottom w:type="dxa" w:w="80"/>
+              <w:right w:type="dxa" w:w="120"/>
+            </w:tcMar>
+          </w:tcPr>
+          <w:p>
+            <w:r>
+              <w:rPr>
+                <w:rFonts w:ascii="Arial" w:cs="Arial" w:eastAsia="Arial" w:hAnsi="Arial"/>
+                <w:sz w:val="20"/>
+                <w:szCs w:val="20"/>
+              </w:rPr>
+              <w:t xml:space="preserve">April 2026</w:t>
+            </w:r>
+          </w:p>
+        </w:tc>
+        <w:tc>
+          <w:tcPr>
+            <w:tcW w:type="dxa" w:w="6860"/>
+            <w:tcBorders>
+              <w:top w:val="single" w:color="CCCCCC" w:sz="1"/>
+              <w:left w:val="single" w:color="CCCCCC" w:sz="1"/>
+              <w:bottom w:val="single" w:color="CCCCCC" w:sz="1"/>
+              <w:right w:val="single" w:color="CCCCCC" w:sz="1"/>
+            </w:tcBorders>
+            <w:tcMar>
+              <w:top w:type="dxa" w:w="80"/>
+              <w:left w:type="dxa" w:w="120"/>
+              <w:bottom w:type="dxa" w:w="80"/>
+              <w:right w:type="dxa" w:w="120"/>
+            </w:tcMar>
+          </w:tcPr>
+          <w:p>
+            <w:r>
+              <w:rPr>
+                <w:rFonts w:ascii="Arial" w:cs="Arial" w:eastAsia="Arial" w:hAnsi="Arial"/>
+                <w:sz w:val="20"/>
+                <w:szCs w:val="20"/>
+              </w:rPr>
+              <w:t xml:space="preserve">Added Section 2 Platform Compliance — MANDATORY. All subsequent sections renumbered.</w:t>
             </w:r>
           </w:p>
         </w:tc>

</xml_diff>